<commit_message>
Masked training all done, Methods all done.
</commit_message>
<xml_diff>
--- a/Report/Methods.docx
+++ b/Report/Methods.docx
@@ -406,9 +406,9 @@
                               <w:tblLook w:val="04A0" w:firstRow="1" w:lastRow="0" w:firstColumn="1" w:lastColumn="0" w:noHBand="0" w:noVBand="1"/>
                             </w:tblPr>
                             <w:tblGrid>
-                              <w:gridCol w:w="1928"/>
-                              <w:gridCol w:w="3304"/>
-                              <w:gridCol w:w="3501"/>
+                              <w:gridCol w:w="1925"/>
+                              <w:gridCol w:w="3301"/>
+                              <w:gridCol w:w="3507"/>
                             </w:tblGrid>
                             <w:tr>
                               <w:tc>
@@ -602,13 +602,7 @@
                           </w:tbl>
                           <w:p>
                             <w:r>
-                              <w:t xml:space="preserve">Table </w:t>
-                            </w:r>
-                            <w:r>
-                              <w:t>1</w:t>
-                            </w:r>
-                            <w:r>
-                              <w:t xml:space="preserve">: Experimental Setup showing Text Representation and Model across Baseline and 4 experiments. </w:t>
+                              <w:t xml:space="preserve">Table 1: Experimental Setup showing Text Representation and Model across Baseline and 4 experiments. </w:t>
                             </w:r>
                           </w:p>
                         </w:txbxContent>
@@ -637,9 +631,9 @@
                         <w:tblLook w:val="04A0" w:firstRow="1" w:lastRow="0" w:firstColumn="1" w:lastColumn="0" w:noHBand="0" w:noVBand="1"/>
                       </w:tblPr>
                       <w:tblGrid>
-                        <w:gridCol w:w="1928"/>
-                        <w:gridCol w:w="3304"/>
-                        <w:gridCol w:w="3501"/>
+                        <w:gridCol w:w="1925"/>
+                        <w:gridCol w:w="3301"/>
+                        <w:gridCol w:w="3507"/>
                       </w:tblGrid>
                       <w:tr>
                         <w:tc>
@@ -833,13 +827,7 @@
                     </w:tbl>
                     <w:p>
                       <w:r>
-                        <w:t xml:space="preserve">Table </w:t>
-                      </w:r>
-                      <w:r>
-                        <w:t>1</w:t>
-                      </w:r>
-                      <w:r>
-                        <w:t xml:space="preserve">: Experimental Setup showing Text Representation and Model across Baseline and 4 experiments. </w:t>
+                        <w:t xml:space="preserve">Table 1: Experimental Setup showing Text Representation and Model across Baseline and 4 experiments. </w:t>
                       </w:r>
                     </w:p>
                   </w:txbxContent>
@@ -873,110 +861,104 @@
         </w:rPr>
       </w:pPr>
       <w:r>
+        <w:t xml:space="preserve">Text representation </w:t>
+      </w:r>
+      <w:r>
+        <w:t>a</w:t>
+      </w:r>
+      <w:r>
+        <w:t xml:space="preserve"> key component </w:t>
+      </w:r>
+      <w:r>
+        <w:t xml:space="preserve">of the pipeline as it determines how linguistic and semantic information is captured from the input. </w:t>
+      </w:r>
+      <w:r>
+        <w:rPr>
+          <w:color w:val="000000" w:themeColor="text1"/>
+        </w:rPr>
+        <w:t xml:space="preserve">Models must reason over long, information-dense contexts which will be particularly challenging for sparse representations. </w:t>
+      </w:r>
+      <w:r>
+        <w:t>The baseline system</w:t>
+      </w:r>
+      <w:r>
+        <w:t xml:space="preserve"> using TF-IDF text representation</w:t>
+      </w:r>
+      <w:r>
+        <w:t xml:space="preserve"> is expected to perform adequately on </w:t>
+      </w:r>
+      <w:r>
+        <w:t>straightforward</w:t>
+      </w:r>
+      <w:r>
+        <w:t xml:space="preserve"> instances </w:t>
+      </w:r>
+      <w:r>
+        <w:t>but will struggle with complex questions and abstracts. TF-IDF representations are not able to capture word order and context which limits their ability to capture nuanced meanings and semantic relationships between words.</w:t>
+      </w:r>
+      <w:r>
+        <w:t xml:space="preserve"> </w:t>
+      </w:r>
+      <w:r>
+        <w:t>We compare our baseline system</w:t>
+      </w:r>
+      <w:r>
+        <w:t xml:space="preserve"> using sparse text representation to BERT-based </w:t>
+      </w:r>
+      <w:r>
+        <w:t>contextual embeddings</w:t>
+      </w:r>
+      <w:r>
+        <w:t xml:space="preserve">. </w:t>
+      </w:r>
+      <w:r>
+        <w:t xml:space="preserve">Contextual embeddings generated by pretrained biomedical language models BiomedBERT and BioClinical ModernBERT are able to encapsulate </w:t>
+      </w:r>
+      <w:r>
+        <w:t xml:space="preserve">context-dependant meanings and are therefore expected to perform better. </w:t>
+      </w:r>
+      <w:r>
+        <w:t xml:space="preserve">Multi-phase fine-tuning of BioBERT with long-answer bag-of-word statistics as additional supervision </w:t>
+      </w:r>
+      <w:r>
+        <w:t xml:space="preserve">has previously </w:t>
+      </w:r>
+      <w:r>
+        <w:t>achieve</w:t>
+      </w:r>
+      <w:r>
+        <w:t>d</w:t>
+      </w:r>
+      <w:r>
+        <w:t xml:space="preserve"> 68.1% accuracy </w:t>
+      </w:r>
+      <w:r>
+        <w:fldChar w:fldCharType="begin"/>
+      </w:r>
+      <w:r>
+        <w:instrText xml:space="preserve"> ADDIN ZOTERO_ITEM CSL_CITATION {"citationID":"P9tMkCGa","properties":{"formattedCitation":"(Jin {\\i{}et al.}, 2019)","plainCitation":"(Jin et al., 2019)","noteIndex":0},"citationItems":[{"id":12,"uris":["http://zotero.org/users/19433107/items/MS59WP97"],"itemData":{"id":12,"type":"paper-conference","abstract":"We introduce PubMedQA, a novel biomedical question answering (QA) dataset collected from PubMed abstracts. The task of PubMedQA is to answer research questions with yes/no/maybe (e.g.: Do preoperative statins reduce atrial fibrillation after coronary artery bypass grafting?) using the corresponding abstracts. PubMedQA has 1k expert-annotated, 61.2k unlabeled and 211.3k artificially generated QA instances. Each PubMedQA instance is composed of (1) a question which is either an existing research article title or derived from one, (2) a context which is the corresponding abstract without its conclusion, (3) a long answer, which is the conclusion of the abstract and, presumably, answers the research question, and (4) a yes/no/maybe answer which summarizes the conclusion. PubMedQA is the first QA dataset where reasoning over biomedical research texts, especially their quantitative contents, is required to answer the questions. Our best performing model, multi-phase fine-tuning of BioBERT with long answer bag-of-word statistics as additional supervision, achieves 68.1% accuracy, compared to single human performance of 78.0% accuracy and majority-baseline of 55.2% accuracy, leaving much room for improvement. PubMedQA is publicly available at https://pubmedqa.github.io.","container-title":"Proceedings of the 2019 Conference on Empirical Methods in Natural Language Processing and the 9th International Joint Conference on Natural Language Processing (EMNLP-IJCNLP)","DOI":"10.18653/v1/D19-1259","event-title":"EMNLP-IJCNLP 2019","page":"2567–2577","publisher":"Association for Computational Linguistics","publisher-place":"Hong Kong, China","source":"ACLWeb","title":"PubMedQA: A Dataset for Biomedical Research Question Answering","title-short":"PubMedQA","URL":"https://aclanthology.org/D19-1259/","author":[{"family":"Jin","given":"Qiao"},{"family":"Dhingra","given":"Bhuwan"},{"family":"Liu","given":"Zhengping"},{"family":"Cohen","given":"William"},{"family":"Lu","given":"Xinghua"}],"editor":[{"family":"Inui","given":"Kentaro"},{"family":"Jiang","given":"Jing"},{"family":"Ng","given":"Vincent"},{"family":"Wan","given":"Xiaojun"}],"accessed":{"date-parts":[["2026",4,2]]},"issued":{"date-parts":[["2019",11]]}}}],"schema":"https://github.com/citation-style-language/schema/raw/master/csl-citation.json"} </w:instrText>
+      </w:r>
+      <w:r>
+        <w:fldChar w:fldCharType="separate"/>
+      </w:r>
+      <w:r>
+        <w:rPr>
+          <w:rFonts w:ascii="Aptos"/>
+        </w:rPr>
+        <w:t xml:space="preserve">(Jin </w:t>
+      </w:r>
+      <w:r>
+        <w:rPr>
+          <w:rFonts w:ascii="Aptos"/>
+          <w:i/>
+          <w:iCs/>
+        </w:rPr>
         <w:lastRenderedPageBreak/>
-        <w:t xml:space="preserve">Text representation </w:t>
-      </w:r>
-      <w:r>
-        <w:t>a</w:t>
-      </w:r>
-      <w:r>
-        <w:t xml:space="preserve"> key component </w:t>
-      </w:r>
-      <w:r>
-        <w:t xml:space="preserve">of the pipeline as it determines how linguistic and semantic information is captured from the input. </w:t>
-      </w:r>
-      <w:r>
-        <w:rPr>
-          <w:color w:val="000000" w:themeColor="text1"/>
-        </w:rPr>
-        <w:t xml:space="preserve">Models must reason over long, information-dense contexts which will be particularly challenging for sparse representations. </w:t>
-      </w:r>
-      <w:r>
-        <w:t>The baseline system</w:t>
-      </w:r>
-      <w:r>
-        <w:t xml:space="preserve"> using TF-IDF text representation</w:t>
-      </w:r>
-      <w:r>
-        <w:t xml:space="preserve"> is expected to perform adequately on </w:t>
-      </w:r>
-      <w:r>
-        <w:t>straightforward</w:t>
-      </w:r>
-      <w:r>
-        <w:t xml:space="preserve"> instances </w:t>
-      </w:r>
-      <w:r>
-        <w:t>but will struggle with complex questions and abstracts. TF-IDF representations are not able to capture word order and context which limits their ability to capture nuanced meanings and semantic relationships between words.</w:t>
-      </w:r>
-      <w:r>
-        <w:t xml:space="preserve"> </w:t>
-      </w:r>
-      <w:r>
-        <w:t>We compare our baseline system</w:t>
-      </w:r>
-      <w:r>
-        <w:t xml:space="preserve"> using sparse text representation to </w:t>
-      </w:r>
-      <w:r>
-        <w:t xml:space="preserve">BERT-based </w:t>
-      </w:r>
-      <w:r>
-        <w:t>contextual embeddings</w:t>
-      </w:r>
-      <w:r>
-        <w:t xml:space="preserve">. </w:t>
-      </w:r>
-      <w:r>
-        <w:t xml:space="preserve">Contextual embeddings generated by pretrained biomedical language models BiomedBERT and BioClinical ModernBERT are able to encapsulate </w:t>
-      </w:r>
-      <w:r>
-        <w:t xml:space="preserve">context-dependant meanings and are therefore expected to perform better. </w:t>
-      </w:r>
-      <w:r>
-        <w:t xml:space="preserve">Multi-phase fine-tuning of BioBERT with long-answer bag-of-word statistics as additional supervision </w:t>
-      </w:r>
-      <w:r>
-        <w:t xml:space="preserve">has previously </w:t>
-      </w:r>
-      <w:r>
-        <w:t>achieve</w:t>
-      </w:r>
-      <w:r>
-        <w:t>d</w:t>
-      </w:r>
-      <w:r>
-        <w:t xml:space="preserve"> 68.1% accuracy </w:t>
-      </w:r>
-      <w:r>
-        <w:fldChar w:fldCharType="begin"/>
-      </w:r>
-      <w:r>
-        <w:instrText xml:space="preserve"> ADDIN ZOTERO_ITEM CSL_CITATION {"citationID":"P9tMkCGa","properties":{"formattedCitation":"(Jin {\\i{}et al.}, 2019)","plainCitation":"(Jin et al., 2019)","noteIndex":0},"citationItems":[{"id":12,"uris":["http://zotero.org/users/19433107/items/MS59WP97"],"itemData":{"id":12,"type":"paper-conference","abstract":"We introduce PubMedQA, a novel biomedical question answering (QA) dataset collected from PubMed abstracts. The task of PubMedQA is to answer research questions with yes/no/maybe (e.g.: Do preoperative statins reduce atrial fibrillation after coronary artery bypass grafting?) using the corresponding abstracts. PubMedQA has 1k expert-annotated, 61.2k unlabeled and 211.3k artificially generated QA instances. Each PubMedQA instance is composed of (1) a question which is either an existing research article title or derived from one, (2) a context which is the corresponding abstract without its conclusion, (3) a long answer, which is the conclusion of the abstract and, presumably, answers the research question, and (4) a yes/no/maybe answer which summarizes the conclusion. PubMedQA is the first QA dataset where reasoning over biomedical research texts, especially their quantitative contents, is required to answer the questions. Our best performing model, multi-phase fine-tuning of BioBERT with long answer bag-of-word statistics as additional supervision, achieves 68.1% accuracy, compared to single human performance of 78.0% accuracy and majority-baseline of 55.2% accuracy, leaving much room for improvement. PubMedQA is publicly available at https://pubmedqa.github.io.","container-title":"Proceedings of the 2019 Conference on Empirical Methods in Natural Language Processing and the 9th International Joint Conference on Natural Language Processing (EMNLP-IJCNLP)","DOI":"10.18653/v1/D19-1259","event-title":"EMNLP-IJCNLP 2019","page":"2567–2577","publisher":"Association for Computational Linguistics","publisher-place":"Hong Kong, China","source":"ACLWeb","title":"PubMedQA: A Dataset for Biomedical Research Question Answering","title-short":"PubMedQA","URL":"https://aclanthology.org/D19-1259/","author":[{"family":"Jin","given":"Qiao"},{"family":"Dhingra","given":"Bhuwan"},{"family":"Liu","given":"Zhengping"},{"family":"Cohen","given":"William"},{"family":"Lu","given":"Xinghua"}],"editor":[{"family":"Inui","given":"Kentaro"},{"family":"Jiang","given":"Jing"},{"family":"Ng","given":"Vincent"},{"family":"Wan","given":"Xiaojun"}],"accessed":{"date-parts":[["2026",4,2]]},"issued":{"date-parts":[["2019",11]]}}}],"schema":"https://github.com/citation-style-language/schema/raw/master/csl-citation.json"} </w:instrText>
-      </w:r>
-      <w:r>
-        <w:fldChar w:fldCharType="separate"/>
-      </w:r>
-      <w:r>
-        <w:rPr>
-          <w:rFonts w:ascii="Aptos" w:cs="Times New Roman"/>
-          <w:kern w:val="0"/>
-        </w:rPr>
-        <w:t xml:space="preserve">(Jin </w:t>
-      </w:r>
-      <w:r>
-        <w:rPr>
-          <w:rFonts w:ascii="Aptos" w:cs="Times New Roman"/>
-          <w:i/>
-          <w:iCs/>
-          <w:kern w:val="0"/>
-        </w:rPr>
         <w:t>et al.</w:t>
       </w:r>
       <w:r>
         <w:rPr>
-          <w:rFonts w:ascii="Aptos" w:cs="Times New Roman"/>
-          <w:kern w:val="0"/>
+          <w:rFonts w:ascii="Aptos"/>
         </w:rPr>
         <w:t>, 2019)</w:t>
       </w:r>
@@ -1230,9 +1212,6 @@
                             </w:tr>
                           </w:tbl>
                           <w:p>
-                            <w:pPr>
-                              <w:spacing w:after="0"/>
-                            </w:pPr>
                             <w:r>
                               <w:t xml:space="preserve">Table </w:t>
                             </w:r>
@@ -1404,9 +1383,6 @@
                       </w:tr>
                     </w:tbl>
                     <w:p>
-                      <w:pPr>
-                        <w:spacing w:after="0"/>
-                      </w:pPr>
                       <w:r>
                         <w:t xml:space="preserve">Table </w:t>
                       </w:r>
@@ -1432,93 +1408,2984 @@
     <w:p/>
     <w:p>
       <w:pPr>
-        <w:pStyle w:val="Bibliography"/>
-      </w:pPr>
-      <w:r>
-        <w:lastRenderedPageBreak/>
-        <w:t>REFERENCES</w:t>
-      </w:r>
+        <w:rPr>
+          <w:b/>
+          <w:bCs/>
+        </w:rPr>
+      </w:pPr>
     </w:p>
     <w:p>
       <w:pPr>
-        <w:pStyle w:val="Bibliography"/>
-        <w:rPr>
-          <w:rFonts w:ascii="Aptos"/>
-        </w:rPr>
-      </w:pPr>
-      <w:r>
-        <w:br/>
-      </w:r>
-      <w:r>
-        <w:fldChar w:fldCharType="begin"/>
-      </w:r>
-      <w:r>
-        <w:instrText xml:space="preserve"> ADDIN ZOTERO_BIBL {"uncited":[],"omitted":[],"custom":[]} CSL_BIBLIOGRAPHY </w:instrText>
-      </w:r>
-      <w:r>
-        <w:fldChar w:fldCharType="separate"/>
-      </w:r>
-      <w:r>
-        <w:rPr>
-          <w:rFonts w:ascii="Aptos"/>
-        </w:rPr>
-        <w:t xml:space="preserve">Jin, Q. </w:t>
-      </w:r>
-      <w:r>
-        <w:rPr>
-          <w:rFonts w:ascii="Aptos"/>
-          <w:i/>
-          <w:iCs/>
-        </w:rPr>
-        <w:t>et al.</w:t>
-      </w:r>
-      <w:r>
-        <w:rPr>
-          <w:rFonts w:ascii="Aptos"/>
-        </w:rPr>
-        <w:t xml:space="preserve"> (2019) ‘PubMedQA: A Dataset for Biomedical Research Question Answering’, in K. Inui et al. (eds) </w:t>
-      </w:r>
-      <w:r>
-        <w:rPr>
-          <w:rFonts w:ascii="Aptos"/>
-          <w:i/>
-          <w:iCs/>
-        </w:rPr>
-        <w:t>Proceedings of the 2019 Conference on Empirical Methods in Natural Language Processing and the 9th International Joint Conference on Natural Language Processing (EMNLP-IJCNLP)</w:t>
-      </w:r>
-      <w:r>
-        <w:rPr>
-          <w:rFonts w:ascii="Aptos"/>
-        </w:rPr>
-        <w:t xml:space="preserve">. </w:t>
-      </w:r>
-      <w:r>
-        <w:rPr>
-          <w:rFonts w:ascii="Aptos"/>
-          <w:i/>
-          <w:iCs/>
-        </w:rPr>
-        <w:t>EMNLP-IJCNLP 2019</w:t>
-      </w:r>
-      <w:r>
-        <w:rPr>
-          <w:rFonts w:ascii="Aptos"/>
-        </w:rPr>
-        <w:t>, Hong Kong, China: Association for Computational Linguistics, pp. 2567–2577. Available at: https://doi.org/10.18653/v1/D19-1259.</w:t>
+        <w:spacing w:after="160" w:line="278" w:lineRule="auto"/>
+        <w:rPr>
+          <w:b/>
+          <w:bCs/>
+        </w:rPr>
+      </w:pPr>
+      <w:r>
+        <w:rPr>
+          <w:b/>
+          <w:bCs/>
+        </w:rPr>
+        <w:br w:type="page"/>
       </w:r>
     </w:p>
     <w:p>
       <w:pPr>
+        <w:rPr>
+          <w:b/>
+          <w:bCs/>
+          <w:sz w:val="40"/>
+          <w:szCs w:val="40"/>
+        </w:rPr>
+      </w:pPr>
+      <w:proofErr w:type="spellStart"/>
+      <w:r>
+        <w:rPr>
+          <w:b/>
+          <w:bCs/>
+          <w:sz w:val="40"/>
+          <w:szCs w:val="40"/>
+        </w:rPr>
+        <w:lastRenderedPageBreak/>
+        <w:t>B</w:t>
+      </w:r>
+      <w:r>
+        <w:rPr>
+          <w:b/>
+          <w:bCs/>
+          <w:sz w:val="40"/>
+          <w:szCs w:val="40"/>
+        </w:rPr>
+        <w:t>iomedclinicalBERT</w:t>
+      </w:r>
+      <w:proofErr w:type="spellEnd"/>
+    </w:p>
+    <w:p>
+      <w:pPr>
+        <w:pStyle w:val="Heading2"/>
+        <w:rPr>
+          <w:rFonts w:ascii="Times New Roman" w:hAnsi="Times New Roman" w:cs="Times New Roman"/>
+          <w:b/>
+          <w:bCs/>
+          <w:color w:val="000000"/>
+        </w:rPr>
+      </w:pPr>
+      <w:r>
+        <w:rPr>
+          <w:rFonts w:ascii="Times New Roman" w:hAnsi="Times New Roman" w:cs="Times New Roman"/>
+          <w:b/>
+          <w:bCs/>
+          <w:color w:val="000000"/>
+        </w:rPr>
+        <w:t>Methods</w:t>
+      </w:r>
+    </w:p>
+    <w:p/>
+    <w:p>
+      <w:pPr>
+        <w:pStyle w:val="NormalWeb"/>
+        <w:rPr>
+          <w:color w:val="000000"/>
+        </w:rPr>
+      </w:pPr>
+      <w:r>
+        <w:rPr>
+          <w:color w:val="000000"/>
+        </w:rPr>
+        <w:t xml:space="preserve">We modelled </w:t>
+      </w:r>
+      <w:proofErr w:type="spellStart"/>
+      <w:r>
+        <w:rPr>
+          <w:color w:val="000000"/>
+        </w:rPr>
+        <w:t>PubMedQA</w:t>
+      </w:r>
+      <w:proofErr w:type="spellEnd"/>
+      <w:r>
+        <w:rPr>
+          <w:color w:val="000000"/>
+        </w:rPr>
+        <w:t xml:space="preserve"> as a</w:t>
+      </w:r>
+      <w:r>
+        <w:rPr>
+          <w:rStyle w:val="apple-converted-space"/>
+          <w:rFonts w:eastAsiaTheme="majorEastAsia"/>
+          <w:color w:val="000000"/>
+        </w:rPr>
+        <w:t> </w:t>
+      </w:r>
+      <w:r>
+        <w:rPr>
+          <w:rStyle w:val="Strong"/>
+          <w:rFonts w:eastAsiaTheme="majorEastAsia"/>
+          <w:b w:val="0"/>
+          <w:bCs w:val="0"/>
+          <w:color w:val="000000"/>
+        </w:rPr>
+        <w:t>single medical question answering pipeline</w:t>
+      </w:r>
+      <w:r>
+        <w:rPr>
+          <w:rStyle w:val="apple-converted-space"/>
+          <w:rFonts w:eastAsiaTheme="majorEastAsia"/>
+          <w:color w:val="000000"/>
+        </w:rPr>
+        <w:t> </w:t>
+      </w:r>
+      <w:r>
+        <w:rPr>
+          <w:color w:val="000000"/>
+        </w:rPr>
+        <w:t>in which a question and its supporting abstract text are mapped to one o</w:t>
+      </w:r>
+      <w:r>
+        <w:rPr>
+          <w:color w:val="000000"/>
+        </w:rPr>
+        <w:t xml:space="preserve">f </w:t>
+      </w:r>
+      <w:r>
+        <w:rPr>
+          <w:color w:val="000000"/>
+        </w:rPr>
+        <w:t>the labels</w:t>
+      </w:r>
+      <w:r>
+        <w:rPr>
+          <w:color w:val="000000"/>
+        </w:rPr>
+        <w:t>:</w:t>
+      </w:r>
+      <w:r>
+        <w:rPr>
+          <w:rStyle w:val="apple-converted-space"/>
+          <w:rFonts w:eastAsiaTheme="majorEastAsia"/>
+          <w:color w:val="000000"/>
+        </w:rPr>
+        <w:t> </w:t>
+      </w:r>
+      <w:r>
+        <w:rPr>
+          <w:rStyle w:val="Strong"/>
+          <w:rFonts w:eastAsiaTheme="majorEastAsia"/>
+          <w:b w:val="0"/>
+          <w:bCs w:val="0"/>
+          <w:color w:val="000000"/>
+        </w:rPr>
+        <w:t>yes</w:t>
+      </w:r>
+      <w:r>
+        <w:rPr>
+          <w:color w:val="000000"/>
+        </w:rPr>
+        <w:t>,</w:t>
+      </w:r>
+      <w:r>
+        <w:rPr>
+          <w:rStyle w:val="apple-converted-space"/>
+          <w:rFonts w:eastAsiaTheme="majorEastAsia"/>
+          <w:color w:val="000000"/>
+        </w:rPr>
+        <w:t> </w:t>
+      </w:r>
+      <w:r>
+        <w:rPr>
+          <w:rStyle w:val="Strong"/>
+          <w:rFonts w:eastAsiaTheme="majorEastAsia"/>
+          <w:b w:val="0"/>
+          <w:bCs w:val="0"/>
+          <w:color w:val="000000"/>
+        </w:rPr>
+        <w:t>no</w:t>
+      </w:r>
+      <w:r>
+        <w:rPr>
+          <w:color w:val="000000"/>
+        </w:rPr>
+        <w:t>, or</w:t>
+      </w:r>
+      <w:r>
+        <w:rPr>
+          <w:rStyle w:val="apple-converted-space"/>
+          <w:rFonts w:eastAsiaTheme="majorEastAsia"/>
+          <w:color w:val="000000"/>
+        </w:rPr>
+        <w:t> </w:t>
+      </w:r>
+      <w:r>
+        <w:rPr>
+          <w:rStyle w:val="Strong"/>
+          <w:rFonts w:eastAsiaTheme="majorEastAsia"/>
+          <w:b w:val="0"/>
+          <w:bCs w:val="0"/>
+          <w:color w:val="000000"/>
+        </w:rPr>
+        <w:t>maybe</w:t>
+      </w:r>
+      <w:r>
+        <w:rPr>
+          <w:color w:val="000000"/>
+        </w:rPr>
+        <w:t xml:space="preserve">.  </w:t>
+      </w:r>
+      <w:r>
+        <w:rPr>
+          <w:color w:val="000000"/>
+        </w:rPr>
+        <w:t>The diagram</w:t>
+      </w:r>
+      <w:r>
+        <w:rPr>
+          <w:color w:val="000000"/>
+        </w:rPr>
+        <w:t xml:space="preserve"> summarises the final system and the decision process that led to it.</w:t>
+      </w:r>
+    </w:p>
+    <w:p>
+      <w:pPr>
+        <w:pStyle w:val="Heading3"/>
+        <w:rPr>
+          <w:rFonts w:cs="Times New Roman"/>
+          <w:b/>
+          <w:bCs/>
+          <w:color w:val="000000"/>
+        </w:rPr>
+      </w:pPr>
+      <w:r>
+        <w:rPr>
+          <w:rFonts w:cs="Times New Roman"/>
+          <w:b/>
+          <w:bCs/>
+          <w:color w:val="000000"/>
+        </w:rPr>
+        <w:t xml:space="preserve">Preprocessing </w:t>
+      </w:r>
+    </w:p>
+    <w:p>
+      <w:pPr>
+        <w:pStyle w:val="NormalWeb"/>
+        <w:rPr>
+          <w:i/>
+          <w:iCs/>
+          <w:color w:val="000000"/>
+        </w:rPr>
+      </w:pPr>
+      <w:r>
+        <w:rPr>
+          <w:i/>
+          <w:iCs/>
+          <w:color w:val="000000"/>
+        </w:rPr>
+        <w:t>{</w:t>
+      </w:r>
+      <w:r>
+        <w:rPr>
+          <w:i/>
+          <w:iCs/>
+          <w:color w:val="000000"/>
+        </w:rPr>
+        <w:t>Each example was represented as a paired input of</w:t>
+      </w:r>
+      <w:r>
+        <w:rPr>
+          <w:rStyle w:val="apple-converted-space"/>
+          <w:rFonts w:eastAsiaTheme="majorEastAsia"/>
+          <w:i/>
+          <w:iCs/>
+          <w:color w:val="000000"/>
+        </w:rPr>
+        <w:t> </w:t>
+      </w:r>
+      <w:r>
+        <w:rPr>
+          <w:rStyle w:val="Strong"/>
+          <w:rFonts w:eastAsiaTheme="majorEastAsia"/>
+          <w:b w:val="0"/>
+          <w:bCs w:val="0"/>
+          <w:i/>
+          <w:iCs/>
+          <w:color w:val="000000"/>
+        </w:rPr>
+        <w:t>QUESTION</w:t>
+      </w:r>
+      <w:r>
+        <w:rPr>
+          <w:rStyle w:val="apple-converted-space"/>
+          <w:rFonts w:eastAsiaTheme="majorEastAsia"/>
+          <w:i/>
+          <w:iCs/>
+          <w:color w:val="000000"/>
+        </w:rPr>
+        <w:t> </w:t>
+      </w:r>
+      <w:r>
+        <w:rPr>
+          <w:i/>
+          <w:iCs/>
+          <w:color w:val="000000"/>
+        </w:rPr>
+        <w:t>and</w:t>
+      </w:r>
+      <w:r>
+        <w:rPr>
+          <w:rStyle w:val="apple-converted-space"/>
+          <w:rFonts w:eastAsiaTheme="majorEastAsia"/>
+          <w:i/>
+          <w:iCs/>
+          <w:color w:val="000000"/>
+        </w:rPr>
+        <w:t> </w:t>
+      </w:r>
+      <w:r>
+        <w:rPr>
+          <w:rStyle w:val="Strong"/>
+          <w:rFonts w:eastAsiaTheme="majorEastAsia"/>
+          <w:b w:val="0"/>
+          <w:bCs w:val="0"/>
+          <w:i/>
+          <w:iCs/>
+          <w:color w:val="000000"/>
+        </w:rPr>
+        <w:t>CONTEXTS</w:t>
+      </w:r>
+      <w:r>
+        <w:rPr>
+          <w:i/>
+          <w:iCs/>
+          <w:color w:val="000000"/>
+        </w:rPr>
+        <w:t>, where the context strings were concatenated into a single text field. Labels were mapped as</w:t>
+      </w:r>
+      <w:r>
+        <w:rPr>
+          <w:rStyle w:val="apple-converted-space"/>
+          <w:rFonts w:eastAsiaTheme="majorEastAsia"/>
+          <w:i/>
+          <w:iCs/>
+          <w:color w:val="000000"/>
+        </w:rPr>
+        <w:t> </w:t>
+      </w:r>
+      <w:r>
+        <w:rPr>
+          <w:rStyle w:val="HTMLCode"/>
+          <w:rFonts w:ascii="Times New Roman" w:eastAsiaTheme="majorEastAsia" w:hAnsi="Times New Roman" w:cs="Times New Roman"/>
+          <w:i/>
+          <w:iCs/>
+          <w:color w:val="000000"/>
+          <w:sz w:val="24"/>
+          <w:szCs w:val="24"/>
+        </w:rPr>
+        <w:t>no = 0</w:t>
+      </w:r>
+      <w:r>
+        <w:rPr>
+          <w:i/>
+          <w:iCs/>
+          <w:color w:val="000000"/>
+        </w:rPr>
+        <w:t>,</w:t>
+      </w:r>
+      <w:r>
+        <w:rPr>
+          <w:rStyle w:val="apple-converted-space"/>
+          <w:rFonts w:eastAsiaTheme="majorEastAsia"/>
+          <w:i/>
+          <w:iCs/>
+          <w:color w:val="000000"/>
+        </w:rPr>
+        <w:t> </w:t>
+      </w:r>
+      <w:r>
+        <w:rPr>
+          <w:rStyle w:val="HTMLCode"/>
+          <w:rFonts w:ascii="Times New Roman" w:eastAsiaTheme="majorEastAsia" w:hAnsi="Times New Roman" w:cs="Times New Roman"/>
+          <w:i/>
+          <w:iCs/>
+          <w:color w:val="000000"/>
+          <w:sz w:val="24"/>
+          <w:szCs w:val="24"/>
+        </w:rPr>
+        <w:t>maybe = 1</w:t>
+      </w:r>
+      <w:r>
+        <w:rPr>
+          <w:i/>
+          <w:iCs/>
+          <w:color w:val="000000"/>
+        </w:rPr>
+        <w:t>, and</w:t>
+      </w:r>
+      <w:r>
+        <w:rPr>
+          <w:rStyle w:val="apple-converted-space"/>
+          <w:rFonts w:eastAsiaTheme="majorEastAsia"/>
+          <w:i/>
+          <w:iCs/>
+          <w:color w:val="000000"/>
+        </w:rPr>
+        <w:t> </w:t>
+      </w:r>
+      <w:r>
+        <w:rPr>
+          <w:rStyle w:val="HTMLCode"/>
+          <w:rFonts w:ascii="Times New Roman" w:eastAsiaTheme="majorEastAsia" w:hAnsi="Times New Roman" w:cs="Times New Roman"/>
+          <w:i/>
+          <w:iCs/>
+          <w:color w:val="000000"/>
+          <w:sz w:val="24"/>
+          <w:szCs w:val="24"/>
+        </w:rPr>
+        <w:t>yes = 2</w:t>
+      </w:r>
+      <w:r>
+        <w:rPr>
+          <w:i/>
+          <w:iCs/>
+          <w:color w:val="000000"/>
+        </w:rPr>
+        <w:t>. Tokenisation used the paired form</w:t>
+      </w:r>
+      <w:r>
+        <w:rPr>
+          <w:rStyle w:val="apple-converted-space"/>
+          <w:rFonts w:eastAsiaTheme="majorEastAsia"/>
+          <w:i/>
+          <w:iCs/>
+          <w:color w:val="000000"/>
+        </w:rPr>
+        <w:t> </w:t>
+      </w:r>
+      <w:proofErr w:type="gramStart"/>
+      <w:r>
+        <w:rPr>
+          <w:rStyle w:val="HTMLCode"/>
+          <w:rFonts w:ascii="Times New Roman" w:eastAsiaTheme="majorEastAsia" w:hAnsi="Times New Roman" w:cs="Times New Roman"/>
+          <w:i/>
+          <w:iCs/>
+          <w:color w:val="000000"/>
+          <w:sz w:val="24"/>
+          <w:szCs w:val="24"/>
+        </w:rPr>
+        <w:t>tokenizer(</w:t>
+      </w:r>
+      <w:proofErr w:type="gramEnd"/>
+      <w:r>
+        <w:rPr>
+          <w:rStyle w:val="HTMLCode"/>
+          <w:rFonts w:ascii="Times New Roman" w:eastAsiaTheme="majorEastAsia" w:hAnsi="Times New Roman" w:cs="Times New Roman"/>
+          <w:i/>
+          <w:iCs/>
+          <w:color w:val="000000"/>
+          <w:sz w:val="24"/>
+          <w:szCs w:val="24"/>
+        </w:rPr>
+        <w:t>question, contexts)</w:t>
+      </w:r>
+      <w:r>
+        <w:rPr>
+          <w:rStyle w:val="apple-converted-space"/>
+          <w:rFonts w:eastAsiaTheme="majorEastAsia"/>
+          <w:i/>
+          <w:iCs/>
+          <w:color w:val="000000"/>
+        </w:rPr>
+        <w:t> </w:t>
+      </w:r>
+      <w:r>
+        <w:rPr>
+          <w:i/>
+          <w:iCs/>
+          <w:color w:val="000000"/>
+        </w:rPr>
+        <w:t>with truncation applied to the context side only, so that the question was always preserved in full.</w:t>
+      </w:r>
+    </w:p>
+    <w:p>
+      <w:pPr>
+        <w:pStyle w:val="NormalWeb"/>
+        <w:rPr>
+          <w:i/>
+          <w:iCs/>
+          <w:color w:val="EE0000"/>
+        </w:rPr>
+      </w:pPr>
+      <w:r>
+        <w:rPr>
+          <w:i/>
+          <w:iCs/>
+          <w:color w:val="000000"/>
+        </w:rPr>
+        <w:t>We set</w:t>
+      </w:r>
+      <w:r>
+        <w:rPr>
+          <w:rStyle w:val="apple-converted-space"/>
+          <w:rFonts w:eastAsiaTheme="majorEastAsia"/>
+          <w:i/>
+          <w:iCs/>
+          <w:color w:val="000000"/>
+        </w:rPr>
+        <w:t> </w:t>
+      </w:r>
+      <w:proofErr w:type="spellStart"/>
+      <w:r>
+        <w:rPr>
+          <w:rStyle w:val="HTMLCode"/>
+          <w:rFonts w:ascii="Times New Roman" w:eastAsiaTheme="majorEastAsia" w:hAnsi="Times New Roman" w:cs="Times New Roman"/>
+          <w:i/>
+          <w:iCs/>
+          <w:color w:val="000000"/>
+          <w:sz w:val="24"/>
+          <w:szCs w:val="24"/>
+        </w:rPr>
+        <w:t>max_length</w:t>
+      </w:r>
+      <w:proofErr w:type="spellEnd"/>
+      <w:r>
+        <w:rPr>
+          <w:rStyle w:val="HTMLCode"/>
+          <w:rFonts w:ascii="Times New Roman" w:eastAsiaTheme="majorEastAsia" w:hAnsi="Times New Roman" w:cs="Times New Roman"/>
+          <w:i/>
+          <w:iCs/>
+          <w:color w:val="000000"/>
+          <w:sz w:val="24"/>
+          <w:szCs w:val="24"/>
+        </w:rPr>
+        <w:t xml:space="preserve"> = 512</w:t>
+      </w:r>
+      <w:r>
+        <w:rPr>
+          <w:i/>
+          <w:iCs/>
+          <w:color w:val="000000"/>
+        </w:rPr>
+        <w:t>. This choice was motivated by a token-length analysis over the expert-labelled data: across</w:t>
+      </w:r>
+      <w:r>
+        <w:rPr>
+          <w:rStyle w:val="apple-converted-space"/>
+          <w:rFonts w:eastAsiaTheme="majorEastAsia"/>
+          <w:i/>
+          <w:iCs/>
+          <w:color w:val="000000"/>
+        </w:rPr>
+        <w:t> </w:t>
+      </w:r>
+      <w:r>
+        <w:rPr>
+          <w:rStyle w:val="Strong"/>
+          <w:rFonts w:eastAsiaTheme="majorEastAsia"/>
+          <w:b w:val="0"/>
+          <w:bCs w:val="0"/>
+          <w:i/>
+          <w:iCs/>
+          <w:color w:val="000000"/>
+        </w:rPr>
+        <w:t>5,000 examples</w:t>
+      </w:r>
+      <w:r>
+        <w:rPr>
+          <w:i/>
+          <w:iCs/>
+          <w:color w:val="000000"/>
+        </w:rPr>
+        <w:t>, the</w:t>
+      </w:r>
+      <w:r>
+        <w:rPr>
+          <w:rStyle w:val="apple-converted-space"/>
+          <w:rFonts w:eastAsiaTheme="majorEastAsia"/>
+          <w:i/>
+          <w:iCs/>
+          <w:color w:val="000000"/>
+        </w:rPr>
+        <w:t> </w:t>
+      </w:r>
+      <w:r>
+        <w:rPr>
+          <w:rStyle w:val="Strong"/>
+          <w:rFonts w:eastAsiaTheme="majorEastAsia"/>
+          <w:b w:val="0"/>
+          <w:bCs w:val="0"/>
+          <w:i/>
+          <w:iCs/>
+          <w:color w:val="000000"/>
+        </w:rPr>
+        <w:t>mean length was 302.08 tokens</w:t>
+      </w:r>
+      <w:r>
+        <w:rPr>
+          <w:i/>
+          <w:iCs/>
+          <w:color w:val="000000"/>
+        </w:rPr>
+        <w:t>, the</w:t>
+      </w:r>
+      <w:r>
+        <w:rPr>
+          <w:rStyle w:val="apple-converted-space"/>
+          <w:rFonts w:eastAsiaTheme="majorEastAsia"/>
+          <w:i/>
+          <w:iCs/>
+          <w:color w:val="000000"/>
+        </w:rPr>
+        <w:t> </w:t>
+      </w:r>
+      <w:r>
+        <w:rPr>
+          <w:rStyle w:val="Strong"/>
+          <w:rFonts w:eastAsiaTheme="majorEastAsia"/>
+          <w:b w:val="0"/>
+          <w:bCs w:val="0"/>
+          <w:i/>
+          <w:iCs/>
+          <w:color w:val="000000"/>
+        </w:rPr>
+        <w:t>median was 300</w:t>
+      </w:r>
+      <w:r>
+        <w:rPr>
+          <w:i/>
+          <w:iCs/>
+          <w:color w:val="000000"/>
+        </w:rPr>
+        <w:t>, the</w:t>
+      </w:r>
+      <w:r>
+        <w:rPr>
+          <w:rStyle w:val="apple-converted-space"/>
+          <w:rFonts w:eastAsiaTheme="majorEastAsia"/>
+          <w:i/>
+          <w:iCs/>
+          <w:color w:val="000000"/>
+        </w:rPr>
+        <w:t> </w:t>
+      </w:r>
+      <w:r>
+        <w:rPr>
+          <w:rStyle w:val="Strong"/>
+          <w:rFonts w:eastAsiaTheme="majorEastAsia"/>
+          <w:b w:val="0"/>
+          <w:bCs w:val="0"/>
+          <w:i/>
+          <w:iCs/>
+          <w:color w:val="000000"/>
+        </w:rPr>
+        <w:t>95th percentile was 443.05</w:t>
+      </w:r>
+      <w:r>
+        <w:rPr>
+          <w:i/>
+          <w:iCs/>
+          <w:color w:val="000000"/>
+        </w:rPr>
+        <w:t>, the</w:t>
+      </w:r>
+      <w:r>
+        <w:rPr>
+          <w:rStyle w:val="apple-converted-space"/>
+          <w:rFonts w:eastAsiaTheme="majorEastAsia"/>
+          <w:i/>
+          <w:iCs/>
+          <w:color w:val="000000"/>
+        </w:rPr>
+        <w:t> </w:t>
+      </w:r>
+      <w:r>
+        <w:rPr>
+          <w:rStyle w:val="Strong"/>
+          <w:rFonts w:eastAsiaTheme="majorEastAsia"/>
+          <w:b w:val="0"/>
+          <w:bCs w:val="0"/>
+          <w:i/>
+          <w:iCs/>
+          <w:color w:val="000000"/>
+        </w:rPr>
+        <w:t>99th percentile was 538.02</w:t>
+      </w:r>
+      <w:r>
+        <w:rPr>
+          <w:i/>
+          <w:iCs/>
+          <w:color w:val="000000"/>
+        </w:rPr>
+        <w:t>, and only</w:t>
+      </w:r>
+      <w:r>
+        <w:rPr>
+          <w:rStyle w:val="apple-converted-space"/>
+          <w:rFonts w:eastAsiaTheme="majorEastAsia"/>
+          <w:i/>
+          <w:iCs/>
+          <w:color w:val="000000"/>
+        </w:rPr>
+        <w:t> </w:t>
+      </w:r>
+      <w:r>
+        <w:rPr>
+          <w:rStyle w:val="Strong"/>
+          <w:rFonts w:eastAsiaTheme="majorEastAsia"/>
+          <w:b w:val="0"/>
+          <w:bCs w:val="0"/>
+          <w:i/>
+          <w:iCs/>
+          <w:color w:val="000000"/>
+        </w:rPr>
+        <w:t>90/5000 examples (1.80%)</w:t>
+      </w:r>
+      <w:r>
+        <w:rPr>
+          <w:rStyle w:val="apple-converted-space"/>
+          <w:rFonts w:eastAsiaTheme="majorEastAsia"/>
+          <w:i/>
+          <w:iCs/>
+          <w:color w:val="000000"/>
+        </w:rPr>
+        <w:t> </w:t>
+      </w:r>
+      <w:r>
+        <w:rPr>
+          <w:i/>
+          <w:iCs/>
+          <w:color w:val="000000"/>
+        </w:rPr>
+        <w:t>exceeded 512 tokens. This showed that 512 captures almost the entire dataset while avoiding unnecessary memory cost.</w:t>
+      </w:r>
+      <w:r>
+        <w:rPr>
+          <w:i/>
+          <w:iCs/>
+          <w:color w:val="000000"/>
+        </w:rPr>
+        <w:t xml:space="preserve">} – </w:t>
+      </w:r>
+      <w:r>
+        <w:rPr>
+          <w:i/>
+          <w:iCs/>
+          <w:color w:val="EE0000"/>
+        </w:rPr>
+        <w:t>This as well can be part of the ‘General Methods’</w:t>
+      </w:r>
+    </w:p>
+    <w:p>
+      <w:pPr>
+        <w:pStyle w:val="Heading3"/>
+        <w:rPr>
+          <w:rFonts w:cs="Times New Roman"/>
+          <w:b/>
+          <w:bCs/>
+          <w:color w:val="000000"/>
+        </w:rPr>
+      </w:pPr>
+      <w:r>
+        <w:rPr>
+          <w:rFonts w:cs="Times New Roman"/>
+          <w:b/>
+          <w:bCs/>
+          <w:color w:val="000000"/>
+        </w:rPr>
+        <w:t>Base classifier and supervised optimisation</w:t>
+      </w:r>
+    </w:p>
+    <w:p>
+      <w:pPr>
+        <w:pStyle w:val="NormalWeb"/>
+        <w:rPr>
+          <w:color w:val="000000"/>
+        </w:rPr>
+      </w:pPr>
+      <w:r>
+        <w:rPr>
+          <w:color w:val="000000"/>
+        </w:rPr>
+        <w:t>The main classifier was</w:t>
+      </w:r>
+      <w:r>
+        <w:rPr>
+          <w:rStyle w:val="apple-converted-space"/>
+          <w:rFonts w:eastAsiaTheme="majorEastAsia"/>
+          <w:color w:val="000000"/>
+        </w:rPr>
+        <w:t> </w:t>
+      </w:r>
+      <w:proofErr w:type="spellStart"/>
+      <w:r>
+        <w:rPr>
+          <w:rStyle w:val="Strong"/>
+          <w:rFonts w:eastAsiaTheme="majorEastAsia"/>
+          <w:b w:val="0"/>
+          <w:bCs w:val="0"/>
+          <w:color w:val="000000"/>
+        </w:rPr>
+        <w:t>BioClinical</w:t>
+      </w:r>
+      <w:proofErr w:type="spellEnd"/>
+      <w:r>
+        <w:rPr>
+          <w:rStyle w:val="Strong"/>
+          <w:rFonts w:eastAsiaTheme="majorEastAsia"/>
+          <w:b w:val="0"/>
+          <w:bCs w:val="0"/>
+          <w:color w:val="000000"/>
+        </w:rPr>
+        <w:t xml:space="preserve"> </w:t>
+      </w:r>
+      <w:proofErr w:type="spellStart"/>
+      <w:r>
+        <w:rPr>
+          <w:rStyle w:val="Strong"/>
+          <w:rFonts w:eastAsiaTheme="majorEastAsia"/>
+          <w:b w:val="0"/>
+          <w:bCs w:val="0"/>
+          <w:color w:val="000000"/>
+        </w:rPr>
+        <w:t>ModernBERT</w:t>
+      </w:r>
+      <w:proofErr w:type="spellEnd"/>
+      <w:r>
+        <w:rPr>
+          <w:rStyle w:val="apple-converted-space"/>
+          <w:rFonts w:eastAsiaTheme="majorEastAsia"/>
+          <w:color w:val="000000"/>
+        </w:rPr>
+        <w:t> </w:t>
+      </w:r>
+      <w:r>
+        <w:rPr>
+          <w:color w:val="000000"/>
+        </w:rPr>
+        <w:t>with a three-class sequence-classification head. Initial naïve fine-tuning on fold 0 showed unstable learning and strong majority-class bias, particularly failure to model the underrepresented</w:t>
+      </w:r>
+      <w:r>
+        <w:rPr>
+          <w:rStyle w:val="apple-converted-space"/>
+          <w:rFonts w:eastAsiaTheme="majorEastAsia"/>
+          <w:color w:val="000000"/>
+        </w:rPr>
+        <w:t> </w:t>
+      </w:r>
+      <w:r>
+        <w:rPr>
+          <w:rStyle w:val="HTMLCode"/>
+          <w:rFonts w:ascii="Times New Roman" w:eastAsiaTheme="majorEastAsia" w:hAnsi="Times New Roman" w:cs="Times New Roman"/>
+          <w:color w:val="000000"/>
+          <w:sz w:val="24"/>
+          <w:szCs w:val="24"/>
+        </w:rPr>
+        <w:t>maybe</w:t>
+      </w:r>
+      <w:r>
+        <w:rPr>
+          <w:rStyle w:val="apple-converted-space"/>
+          <w:rFonts w:eastAsiaTheme="majorEastAsia"/>
+          <w:color w:val="000000"/>
+        </w:rPr>
+        <w:t> </w:t>
+      </w:r>
+      <w:r>
+        <w:rPr>
+          <w:color w:val="000000"/>
+        </w:rPr>
+        <w:t>class. We therefore treated</w:t>
+      </w:r>
+      <w:r>
+        <w:rPr>
+          <w:rStyle w:val="apple-converted-space"/>
+          <w:rFonts w:eastAsiaTheme="majorEastAsia"/>
+          <w:color w:val="000000"/>
+        </w:rPr>
+        <w:t> </w:t>
+      </w:r>
+      <w:r>
+        <w:rPr>
+          <w:rStyle w:val="Strong"/>
+          <w:rFonts w:eastAsiaTheme="majorEastAsia"/>
+          <w:b w:val="0"/>
+          <w:bCs w:val="0"/>
+          <w:color w:val="000000"/>
+        </w:rPr>
+        <w:t>class imbalance</w:t>
+      </w:r>
+      <w:r>
+        <w:rPr>
+          <w:rStyle w:val="apple-converted-space"/>
+          <w:rFonts w:eastAsiaTheme="majorEastAsia"/>
+          <w:color w:val="000000"/>
+        </w:rPr>
+        <w:t> </w:t>
+      </w:r>
+      <w:r>
+        <w:rPr>
+          <w:color w:val="000000"/>
+        </w:rPr>
+        <w:t>as the main optimisation problem and compared several training recipes</w:t>
+      </w:r>
+      <w:r>
+        <w:rPr>
+          <w:color w:val="000000"/>
+        </w:rPr>
+        <w:t xml:space="preserve"> to address this</w:t>
+      </w:r>
+      <w:r>
+        <w:rPr>
+          <w:color w:val="000000"/>
+        </w:rPr>
+        <w:t>: plain fine-tuning, class-weighted loss, class-weighted loss plus weighted sampling, and weighted sampling alone.</w:t>
+      </w:r>
+    </w:p>
+    <w:p>
+      <w:pPr>
+        <w:pStyle w:val="NormalWeb"/>
+        <w:rPr>
+          <w:color w:val="000000"/>
+        </w:rPr>
+      </w:pPr>
+      <w:r>
+        <w:rPr>
+          <w:color w:val="000000"/>
+        </w:rPr>
+        <w:t>Model selection used</w:t>
+      </w:r>
+      <w:r>
+        <w:rPr>
+          <w:rStyle w:val="apple-converted-space"/>
+          <w:rFonts w:eastAsiaTheme="majorEastAsia"/>
+          <w:color w:val="000000"/>
+        </w:rPr>
+        <w:t> </w:t>
+      </w:r>
+      <w:r>
+        <w:rPr>
+          <w:rStyle w:val="Strong"/>
+          <w:rFonts w:eastAsiaTheme="majorEastAsia"/>
+          <w:b w:val="0"/>
+          <w:bCs w:val="0"/>
+          <w:color w:val="000000"/>
+        </w:rPr>
+        <w:t>macro F1</w:t>
+      </w:r>
+      <w:r>
+        <w:rPr>
+          <w:rStyle w:val="apple-converted-space"/>
+          <w:rFonts w:eastAsiaTheme="majorEastAsia"/>
+          <w:color w:val="000000"/>
+        </w:rPr>
+        <w:t> </w:t>
+      </w:r>
+      <w:r>
+        <w:rPr>
+          <w:color w:val="000000"/>
+        </w:rPr>
+        <w:t>as the primary metric, with accuracy and per-class F1 as secondary diagnostics. This was important because fold 0 was imbalanced: in training,</w:t>
+      </w:r>
+      <w:r>
+        <w:rPr>
+          <w:rStyle w:val="apple-converted-space"/>
+          <w:rFonts w:eastAsiaTheme="majorEastAsia"/>
+          <w:color w:val="000000"/>
+        </w:rPr>
+        <w:t> </w:t>
+      </w:r>
+      <w:r>
+        <w:rPr>
+          <w:rStyle w:val="HTMLCode"/>
+          <w:rFonts w:ascii="Times New Roman" w:eastAsiaTheme="majorEastAsia" w:hAnsi="Times New Roman" w:cs="Times New Roman"/>
+          <w:color w:val="000000"/>
+          <w:sz w:val="24"/>
+          <w:szCs w:val="24"/>
+        </w:rPr>
+        <w:t>yes = 249</w:t>
+      </w:r>
+      <w:r>
+        <w:rPr>
+          <w:color w:val="000000"/>
+        </w:rPr>
+        <w:t>,</w:t>
+      </w:r>
+      <w:r>
+        <w:rPr>
+          <w:rStyle w:val="apple-converted-space"/>
+          <w:rFonts w:eastAsiaTheme="majorEastAsia"/>
+          <w:color w:val="000000"/>
+        </w:rPr>
+        <w:t> </w:t>
+      </w:r>
+      <w:r>
+        <w:rPr>
+          <w:rStyle w:val="HTMLCode"/>
+          <w:rFonts w:ascii="Times New Roman" w:eastAsiaTheme="majorEastAsia" w:hAnsi="Times New Roman" w:cs="Times New Roman"/>
+          <w:color w:val="000000"/>
+          <w:sz w:val="24"/>
+          <w:szCs w:val="24"/>
+        </w:rPr>
+        <w:t>no = 152</w:t>
+      </w:r>
+      <w:r>
+        <w:rPr>
+          <w:color w:val="000000"/>
+        </w:rPr>
+        <w:t>, and</w:t>
+      </w:r>
+      <w:r>
+        <w:rPr>
+          <w:rStyle w:val="apple-converted-space"/>
+          <w:rFonts w:eastAsiaTheme="majorEastAsia"/>
+          <w:color w:val="000000"/>
+        </w:rPr>
+        <w:t> </w:t>
+      </w:r>
+      <w:r>
+        <w:rPr>
+          <w:rStyle w:val="HTMLCode"/>
+          <w:rFonts w:ascii="Times New Roman" w:eastAsiaTheme="majorEastAsia" w:hAnsi="Times New Roman" w:cs="Times New Roman"/>
+          <w:color w:val="000000"/>
+          <w:sz w:val="24"/>
+          <w:szCs w:val="24"/>
+        </w:rPr>
+        <w:t>maybe = 49</w:t>
+      </w:r>
+      <w:r>
+        <w:rPr>
+          <w:color w:val="000000"/>
+        </w:rPr>
+        <w:t>; in development,</w:t>
+      </w:r>
+      <w:r>
+        <w:rPr>
+          <w:rStyle w:val="apple-converted-space"/>
+          <w:rFonts w:eastAsiaTheme="majorEastAsia"/>
+          <w:color w:val="000000"/>
+        </w:rPr>
+        <w:t> </w:t>
+      </w:r>
+      <w:r>
+        <w:rPr>
+          <w:rStyle w:val="HTMLCode"/>
+          <w:rFonts w:ascii="Times New Roman" w:eastAsiaTheme="majorEastAsia" w:hAnsi="Times New Roman" w:cs="Times New Roman"/>
+          <w:color w:val="000000"/>
+          <w:sz w:val="24"/>
+          <w:szCs w:val="24"/>
+        </w:rPr>
+        <w:t>yes = 27</w:t>
+      </w:r>
+      <w:r>
+        <w:rPr>
+          <w:color w:val="000000"/>
+        </w:rPr>
+        <w:t>,</w:t>
+      </w:r>
+      <w:r>
+        <w:rPr>
+          <w:rStyle w:val="apple-converted-space"/>
+          <w:rFonts w:eastAsiaTheme="majorEastAsia"/>
+          <w:color w:val="000000"/>
+        </w:rPr>
+        <w:t> </w:t>
+      </w:r>
+      <w:r>
+        <w:rPr>
+          <w:rStyle w:val="HTMLCode"/>
+          <w:rFonts w:ascii="Times New Roman" w:eastAsiaTheme="majorEastAsia" w:hAnsi="Times New Roman" w:cs="Times New Roman"/>
+          <w:color w:val="000000"/>
+          <w:sz w:val="24"/>
+          <w:szCs w:val="24"/>
+        </w:rPr>
+        <w:t>no = 17</w:t>
+      </w:r>
+      <w:r>
+        <w:rPr>
+          <w:color w:val="000000"/>
+        </w:rPr>
+        <w:t>, and</w:t>
+      </w:r>
+      <w:r>
+        <w:rPr>
+          <w:rStyle w:val="apple-converted-space"/>
+          <w:rFonts w:eastAsiaTheme="majorEastAsia"/>
+          <w:color w:val="000000"/>
+        </w:rPr>
+        <w:t> </w:t>
+      </w:r>
+      <w:r>
+        <w:rPr>
+          <w:rStyle w:val="HTMLCode"/>
+          <w:rFonts w:ascii="Times New Roman" w:eastAsiaTheme="majorEastAsia" w:hAnsi="Times New Roman" w:cs="Times New Roman"/>
+          <w:color w:val="000000"/>
+          <w:sz w:val="24"/>
+          <w:szCs w:val="24"/>
+        </w:rPr>
+        <w:t>maybe = 6</w:t>
+      </w:r>
+      <w:r>
+        <w:rPr>
+          <w:color w:val="000000"/>
+        </w:rPr>
+        <w:t>. The final</w:t>
+      </w:r>
+      <w:r>
+        <w:rPr>
+          <w:color w:val="000000"/>
+        </w:rPr>
+        <w:t xml:space="preserve"> (best)</w:t>
+      </w:r>
+      <w:r>
+        <w:rPr>
+          <w:color w:val="000000"/>
+        </w:rPr>
+        <w:t xml:space="preserve"> supervised recipe used</w:t>
+      </w:r>
+      <w:r>
+        <w:rPr>
+          <w:rStyle w:val="apple-converted-space"/>
+          <w:rFonts w:eastAsiaTheme="majorEastAsia"/>
+          <w:color w:val="000000"/>
+        </w:rPr>
+        <w:t> </w:t>
+      </w:r>
+      <w:r>
+        <w:rPr>
+          <w:rStyle w:val="Strong"/>
+          <w:rFonts w:eastAsiaTheme="majorEastAsia"/>
+          <w:b w:val="0"/>
+          <w:bCs w:val="0"/>
+          <w:color w:val="000000"/>
+        </w:rPr>
+        <w:t>weighted sampling only</w:t>
+      </w:r>
+      <w:r>
+        <w:rPr>
+          <w:color w:val="000000"/>
+        </w:rPr>
+        <w:t>,</w:t>
+      </w:r>
+      <w:r>
+        <w:rPr>
+          <w:rStyle w:val="apple-converted-space"/>
+          <w:rFonts w:eastAsiaTheme="majorEastAsia"/>
+          <w:color w:val="000000"/>
+        </w:rPr>
+        <w:t> </w:t>
+      </w:r>
+      <w:r>
+        <w:rPr>
+          <w:rStyle w:val="Strong"/>
+          <w:rFonts w:eastAsiaTheme="majorEastAsia"/>
+          <w:b w:val="0"/>
+          <w:bCs w:val="0"/>
+          <w:color w:val="000000"/>
+        </w:rPr>
+        <w:t>no class-weighted loss</w:t>
+      </w:r>
+      <w:r>
+        <w:rPr>
+          <w:color w:val="000000"/>
+        </w:rPr>
+        <w:t>, a learning rate of</w:t>
+      </w:r>
+      <w:r>
+        <w:rPr>
+          <w:rStyle w:val="apple-converted-space"/>
+          <w:rFonts w:eastAsiaTheme="majorEastAsia"/>
+          <w:color w:val="000000"/>
+        </w:rPr>
+        <w:t> </w:t>
+      </w:r>
+      <w:r>
+        <w:rPr>
+          <w:rStyle w:val="Strong"/>
+          <w:rFonts w:eastAsiaTheme="majorEastAsia"/>
+          <w:b w:val="0"/>
+          <w:bCs w:val="0"/>
+          <w:color w:val="000000"/>
+        </w:rPr>
+        <w:t>8e-6</w:t>
+      </w:r>
+      <w:r>
+        <w:rPr>
+          <w:color w:val="000000"/>
+        </w:rPr>
+        <w:t>,</w:t>
+      </w:r>
+      <w:r>
+        <w:rPr>
+          <w:rStyle w:val="apple-converted-space"/>
+          <w:rFonts w:eastAsiaTheme="majorEastAsia"/>
+          <w:color w:val="000000"/>
+        </w:rPr>
+        <w:t> </w:t>
+      </w:r>
+      <w:proofErr w:type="spellStart"/>
+      <w:r>
+        <w:rPr>
+          <w:rStyle w:val="HTMLCode"/>
+          <w:rFonts w:ascii="Times New Roman" w:eastAsiaTheme="majorEastAsia" w:hAnsi="Times New Roman" w:cs="Times New Roman"/>
+          <w:color w:val="000000"/>
+          <w:sz w:val="24"/>
+          <w:szCs w:val="24"/>
+        </w:rPr>
+        <w:t>gradient_accumulation_steps</w:t>
+      </w:r>
+      <w:proofErr w:type="spellEnd"/>
+      <w:r>
+        <w:rPr>
+          <w:rStyle w:val="HTMLCode"/>
+          <w:rFonts w:ascii="Times New Roman" w:eastAsiaTheme="majorEastAsia" w:hAnsi="Times New Roman" w:cs="Times New Roman"/>
+          <w:color w:val="000000"/>
+          <w:sz w:val="24"/>
+          <w:szCs w:val="24"/>
+        </w:rPr>
+        <w:t xml:space="preserve"> = 2</w:t>
+      </w:r>
+      <w:r>
+        <w:rPr>
+          <w:color w:val="000000"/>
+        </w:rPr>
+        <w:t>, dynamic padding with</w:t>
+      </w:r>
+      <w:r>
+        <w:rPr>
+          <w:rStyle w:val="apple-converted-space"/>
+          <w:rFonts w:eastAsiaTheme="majorEastAsia"/>
+          <w:color w:val="000000"/>
+        </w:rPr>
+        <w:t> </w:t>
+      </w:r>
+      <w:proofErr w:type="spellStart"/>
+      <w:r>
+        <w:rPr>
+          <w:rStyle w:val="HTMLCode"/>
+          <w:rFonts w:ascii="Times New Roman" w:eastAsiaTheme="majorEastAsia" w:hAnsi="Times New Roman" w:cs="Times New Roman"/>
+          <w:color w:val="000000"/>
+          <w:sz w:val="24"/>
+          <w:szCs w:val="24"/>
+        </w:rPr>
+        <w:t>DataCollatorWithPadding</w:t>
+      </w:r>
+      <w:proofErr w:type="spellEnd"/>
+      <w:r>
+        <w:rPr>
+          <w:color w:val="000000"/>
+        </w:rPr>
+        <w:t>, early stopping with patience 2, and checkpoint selection by validation macro F1. This gave the best balance across classes and became the reference point for all later improvements.</w:t>
+      </w:r>
+    </w:p>
+    <w:p>
+      <w:pPr>
+        <w:pStyle w:val="Heading3"/>
+        <w:rPr>
+          <w:rFonts w:cs="Times New Roman"/>
+          <w:b/>
+          <w:bCs/>
+          <w:color w:val="000000"/>
+        </w:rPr>
+      </w:pPr>
+      <w:r>
+        <w:rPr>
+          <w:rFonts w:cs="Times New Roman"/>
+          <w:b/>
+          <w:bCs/>
+          <w:color w:val="000000"/>
+        </w:rPr>
+        <w:t>Masked-training pilot and route selection</w:t>
+      </w:r>
+    </w:p>
+    <w:p>
+      <w:pPr>
+        <w:pStyle w:val="NormalWeb"/>
+        <w:rPr>
+          <w:color w:val="000000"/>
+        </w:rPr>
+      </w:pPr>
+      <w:r>
+        <w:rPr>
+          <w:color w:val="000000"/>
+        </w:rPr>
+        <w:t>Our first proposed improvement was</w:t>
+      </w:r>
+      <w:r>
+        <w:rPr>
+          <w:rStyle w:val="apple-converted-space"/>
+          <w:rFonts w:eastAsiaTheme="majorEastAsia"/>
+          <w:color w:val="000000"/>
+        </w:rPr>
+        <w:t> </w:t>
+      </w:r>
+      <w:r>
+        <w:rPr>
+          <w:rStyle w:val="Strong"/>
+          <w:rFonts w:eastAsiaTheme="majorEastAsia"/>
+          <w:b w:val="0"/>
+          <w:bCs w:val="0"/>
+          <w:color w:val="000000"/>
+        </w:rPr>
+        <w:t>masked language model adaptation</w:t>
+      </w:r>
+      <w:r>
+        <w:rPr>
+          <w:rStyle w:val="apple-converted-space"/>
+          <w:rFonts w:eastAsiaTheme="majorEastAsia"/>
+          <w:color w:val="000000"/>
+        </w:rPr>
+        <w:t> </w:t>
+      </w:r>
+      <w:r>
+        <w:rPr>
+          <w:color w:val="000000"/>
+        </w:rPr>
+        <w:t xml:space="preserve">on </w:t>
+      </w:r>
+      <w:r>
+        <w:rPr>
+          <w:color w:val="000000"/>
+        </w:rPr>
+        <w:t xml:space="preserve">the </w:t>
+      </w:r>
+      <w:r>
+        <w:rPr>
+          <w:color w:val="000000"/>
+        </w:rPr>
+        <w:t>unlabelled biomedical text. The hypothesis was that further encoder adaptation on unlabelled data would improve downstream question answering. To test this cheaply, we ran a pilot masked-training stage on</w:t>
+      </w:r>
+      <w:r>
+        <w:rPr>
+          <w:rStyle w:val="apple-converted-space"/>
+          <w:rFonts w:eastAsiaTheme="majorEastAsia"/>
+          <w:color w:val="000000"/>
+        </w:rPr>
+        <w:t> </w:t>
+      </w:r>
+      <w:r>
+        <w:rPr>
+          <w:rStyle w:val="Strong"/>
+          <w:rFonts w:eastAsiaTheme="majorEastAsia"/>
+          <w:b w:val="0"/>
+          <w:bCs w:val="0"/>
+          <w:color w:val="000000"/>
+        </w:rPr>
+        <w:t>5,000 examples</w:t>
+      </w:r>
+      <w:r>
+        <w:rPr>
+          <w:rStyle w:val="apple-converted-space"/>
+          <w:rFonts w:eastAsiaTheme="majorEastAsia"/>
+          <w:color w:val="000000"/>
+        </w:rPr>
+        <w:t> </w:t>
+      </w:r>
+      <w:r>
+        <w:rPr>
+          <w:color w:val="000000"/>
+        </w:rPr>
+        <w:t>drawn from an unlabelled pool of roughly</w:t>
+      </w:r>
+      <w:r>
+        <w:rPr>
+          <w:rStyle w:val="apple-converted-space"/>
+          <w:rFonts w:eastAsiaTheme="majorEastAsia"/>
+          <w:color w:val="000000"/>
+        </w:rPr>
+        <w:t> </w:t>
+      </w:r>
+      <w:r>
+        <w:rPr>
+          <w:rStyle w:val="Strong"/>
+          <w:rFonts w:eastAsiaTheme="majorEastAsia"/>
+          <w:b w:val="0"/>
+          <w:bCs w:val="0"/>
+          <w:color w:val="000000"/>
+        </w:rPr>
+        <w:t>42,000 examples</w:t>
+      </w:r>
+      <w:r>
+        <w:rPr>
+          <w:color w:val="000000"/>
+        </w:rPr>
+        <w:t>, with a smaller held-out subset for MLM evaluation. The remaining unlabelled data was reserved in case the pilot succeeded</w:t>
+      </w:r>
+      <w:r>
+        <w:rPr>
+          <w:color w:val="000000"/>
+        </w:rPr>
+        <w:t xml:space="preserve"> for further finetuning </w:t>
+      </w:r>
+      <w:proofErr w:type="gramStart"/>
+      <w:r>
+        <w:rPr>
+          <w:color w:val="000000"/>
+        </w:rPr>
+        <w:t>later on</w:t>
+      </w:r>
+      <w:proofErr w:type="gramEnd"/>
+      <w:r>
+        <w:rPr>
+          <w:color w:val="000000"/>
+        </w:rPr>
+        <w:t xml:space="preserve"> (pseudo-labelling)</w:t>
+      </w:r>
+      <w:r>
+        <w:rPr>
+          <w:color w:val="000000"/>
+        </w:rPr>
+        <w:t>.</w:t>
+      </w:r>
+    </w:p>
+    <w:p>
+      <w:pPr>
+        <w:pStyle w:val="NormalWeb"/>
+        <w:rPr>
+          <w:color w:val="000000"/>
+        </w:rPr>
+      </w:pPr>
+      <w:r>
+        <w:rPr>
+          <w:color w:val="000000"/>
+        </w:rPr>
+        <w:lastRenderedPageBreak/>
+        <w:t>All experiments were run on a</w:t>
+      </w:r>
+      <w:r>
+        <w:rPr>
+          <w:rStyle w:val="apple-converted-space"/>
+          <w:rFonts w:eastAsiaTheme="majorEastAsia"/>
+          <w:color w:val="000000"/>
+        </w:rPr>
+        <w:t> </w:t>
+      </w:r>
+      <w:r>
+        <w:rPr>
+          <w:rStyle w:val="Strong"/>
+          <w:rFonts w:eastAsiaTheme="majorEastAsia"/>
+          <w:b w:val="0"/>
+          <w:bCs w:val="0"/>
+          <w:color w:val="000000"/>
+        </w:rPr>
+        <w:t>MacBook M1 Max with 32 GB RAM</w:t>
+      </w:r>
+      <w:r>
+        <w:rPr>
+          <w:rStyle w:val="apple-converted-space"/>
+          <w:rFonts w:eastAsiaTheme="majorEastAsia"/>
+          <w:color w:val="000000"/>
+        </w:rPr>
+        <w:t> </w:t>
+      </w:r>
+      <w:r>
+        <w:rPr>
+          <w:color w:val="000000"/>
+        </w:rPr>
+        <w:t xml:space="preserve">using </w:t>
+      </w:r>
+      <w:proofErr w:type="spellStart"/>
+      <w:r>
+        <w:rPr>
+          <w:color w:val="000000"/>
+        </w:rPr>
+        <w:t>PyTorch</w:t>
+      </w:r>
+      <w:proofErr w:type="spellEnd"/>
+      <w:r>
+        <w:rPr>
+          <w:color w:val="000000"/>
+        </w:rPr>
+        <w:t xml:space="preserve"> and Hugging Face on MPS. </w:t>
+      </w:r>
+      <w:r>
+        <w:rPr>
+          <w:color w:val="000000"/>
+        </w:rPr>
+        <w:t>M</w:t>
+      </w:r>
+      <w:r>
+        <w:rPr>
+          <w:color w:val="000000"/>
+        </w:rPr>
+        <w:t>asked training was far more memory-intensive than downstream classification. Peak RAM remained high even when batch size was reduced</w:t>
+      </w:r>
+      <w:r>
+        <w:rPr>
+          <w:color w:val="000000"/>
+        </w:rPr>
+        <w:t xml:space="preserve"> from 8 to 2</w:t>
+      </w:r>
+      <w:r>
+        <w:rPr>
+          <w:color w:val="000000"/>
+        </w:rPr>
+        <w:t xml:space="preserve">, indicating that memory use was driven mainly by model weights, activations, token-level tensors, and full bidirectional self-attention rather than batch size alone. Several reruns were required while adjusting batch size, gradient accumulation, sequence length, and epochs simply to obtain stable runs. Although MLM validation loss improved, downstream </w:t>
+      </w:r>
+      <w:proofErr w:type="spellStart"/>
+      <w:r>
+        <w:rPr>
+          <w:color w:val="000000"/>
+        </w:rPr>
+        <w:t>PubMedQA</w:t>
+      </w:r>
+      <w:proofErr w:type="spellEnd"/>
+      <w:r>
+        <w:rPr>
+          <w:color w:val="000000"/>
+        </w:rPr>
+        <w:t xml:space="preserve"> classification did not improve, even after extending training and restoring the full</w:t>
+      </w:r>
+      <w:r>
+        <w:rPr>
+          <w:rStyle w:val="apple-converted-space"/>
+          <w:rFonts w:eastAsiaTheme="majorEastAsia"/>
+          <w:color w:val="000000"/>
+        </w:rPr>
+        <w:t> </w:t>
+      </w:r>
+      <w:r>
+        <w:rPr>
+          <w:rStyle w:val="Strong"/>
+          <w:rFonts w:eastAsiaTheme="majorEastAsia"/>
+          <w:b w:val="0"/>
+          <w:bCs w:val="0"/>
+          <w:color w:val="000000"/>
+        </w:rPr>
+        <w:t>512-token</w:t>
+      </w:r>
+      <w:r>
+        <w:rPr>
+          <w:rStyle w:val="apple-converted-space"/>
+          <w:rFonts w:eastAsiaTheme="majorEastAsia"/>
+          <w:color w:val="000000"/>
+        </w:rPr>
+        <w:t> </w:t>
+      </w:r>
+      <w:r>
+        <w:rPr>
+          <w:color w:val="000000"/>
+        </w:rPr>
+        <w:t>length</w:t>
+      </w:r>
+      <w:r>
+        <w:rPr>
+          <w:color w:val="000000"/>
+        </w:rPr>
+        <w:t xml:space="preserve"> from an initial 384</w:t>
+      </w:r>
+      <w:r>
+        <w:rPr>
+          <w:color w:val="000000"/>
+        </w:rPr>
+        <w:t>. We therefore rejected the masked-training branch and continued with the better-performing base classifier route.</w:t>
+      </w:r>
+    </w:p>
+    <w:p>
+      <w:pPr>
+        <w:pStyle w:val="Heading3"/>
+        <w:rPr>
+          <w:rFonts w:cs="Times New Roman"/>
+          <w:b/>
+          <w:bCs/>
+          <w:color w:val="000000"/>
+        </w:rPr>
+      </w:pPr>
+      <w:r>
+        <w:rPr>
+          <w:rFonts w:cs="Times New Roman"/>
+          <w:b/>
+          <w:bCs/>
+          <w:color w:val="000000"/>
+        </w:rPr>
+        <w:t>Weak-to-strong downstream pipeline</w:t>
+      </w:r>
+    </w:p>
+    <w:p>
+      <w:pPr>
+        <w:pStyle w:val="NormalWeb"/>
+        <w:rPr>
+          <w:color w:val="000000"/>
+        </w:rPr>
+      </w:pPr>
+      <w:r>
+        <w:rPr>
+          <w:color w:val="000000"/>
+        </w:rPr>
+        <w:t>After rejecting masked adaptation, we designed the final system as a</w:t>
+      </w:r>
+      <w:r>
+        <w:rPr>
+          <w:rStyle w:val="apple-converted-space"/>
+          <w:rFonts w:eastAsiaTheme="majorEastAsia"/>
+          <w:color w:val="000000"/>
+        </w:rPr>
+        <w:t> </w:t>
+      </w:r>
+      <w:r>
+        <w:rPr>
+          <w:rStyle w:val="Strong"/>
+          <w:rFonts w:eastAsiaTheme="majorEastAsia"/>
+          <w:b w:val="0"/>
+          <w:bCs w:val="0"/>
+          <w:color w:val="000000"/>
+        </w:rPr>
+        <w:t>weak-to-strong semi-supervised pipeline</w:t>
+      </w:r>
+      <w:r>
+        <w:rPr>
+          <w:color w:val="000000"/>
+        </w:rPr>
+        <w:t>. The weakly labelled set contained approximately</w:t>
+      </w:r>
+      <w:r>
+        <w:rPr>
+          <w:rStyle w:val="apple-converted-space"/>
+          <w:rFonts w:eastAsiaTheme="majorEastAsia"/>
+          <w:color w:val="000000"/>
+        </w:rPr>
+        <w:t> </w:t>
+      </w:r>
+      <w:r>
+        <w:rPr>
+          <w:rStyle w:val="Strong"/>
+          <w:rFonts w:eastAsiaTheme="majorEastAsia"/>
+          <w:b w:val="0"/>
+          <w:bCs w:val="0"/>
+          <w:color w:val="000000"/>
+        </w:rPr>
+        <w:t>200,000 yes/no examples</w:t>
+      </w:r>
+      <w:r>
+        <w:rPr>
+          <w:color w:val="000000"/>
+        </w:rPr>
+        <w:t>. We first fine-tuned the encoder on this binary task using a binary classification head, then discarded that head and retained only the adapted encoder. This stage was intended to teach coarse biomedical task structure cheaply, without forcing the model to learn the</w:t>
+      </w:r>
+      <w:r>
+        <w:rPr>
+          <w:rStyle w:val="apple-converted-space"/>
+          <w:rFonts w:eastAsiaTheme="majorEastAsia"/>
+          <w:color w:val="000000"/>
+        </w:rPr>
+        <w:t> </w:t>
+      </w:r>
+      <w:r>
+        <w:rPr>
+          <w:rStyle w:val="HTMLCode"/>
+          <w:rFonts w:ascii="Times New Roman" w:eastAsiaTheme="majorEastAsia" w:hAnsi="Times New Roman" w:cs="Times New Roman"/>
+          <w:color w:val="000000"/>
+          <w:sz w:val="24"/>
+          <w:szCs w:val="24"/>
+        </w:rPr>
+        <w:t>maybe</w:t>
+      </w:r>
+      <w:r>
+        <w:rPr>
+          <w:rStyle w:val="apple-converted-space"/>
+          <w:rFonts w:eastAsiaTheme="majorEastAsia"/>
+          <w:color w:val="000000"/>
+        </w:rPr>
+        <w:t> </w:t>
+      </w:r>
+      <w:r>
+        <w:rPr>
+          <w:color w:val="000000"/>
+        </w:rPr>
+        <w:t>class from weak labels that did not contain it.</w:t>
+      </w:r>
+    </w:p>
+    <w:p>
+      <w:pPr>
+        <w:pStyle w:val="NormalWeb"/>
+        <w:rPr>
+          <w:color w:val="000000"/>
+        </w:rPr>
+      </w:pPr>
+      <w:r>
+        <w:rPr>
+          <w:color w:val="000000"/>
+        </w:rPr>
+        <w:t>We then constructed</w:t>
+      </w:r>
+      <w:r>
+        <w:rPr>
+          <w:rStyle w:val="apple-converted-space"/>
+          <w:rFonts w:eastAsiaTheme="majorEastAsia"/>
+          <w:color w:val="000000"/>
+        </w:rPr>
+        <w:t> </w:t>
+      </w:r>
+      <w:r>
+        <w:rPr>
+          <w:rStyle w:val="Strong"/>
+          <w:rFonts w:eastAsiaTheme="majorEastAsia"/>
+          <w:b w:val="0"/>
+          <w:bCs w:val="0"/>
+          <w:color w:val="000000"/>
+        </w:rPr>
+        <w:t>three downstream pipelines</w:t>
+      </w:r>
+      <w:r>
+        <w:rPr>
+          <w:color w:val="000000"/>
+        </w:rPr>
+        <w:t>, all evaluated on the same</w:t>
+      </w:r>
+      <w:r>
+        <w:rPr>
+          <w:rStyle w:val="apple-converted-space"/>
+          <w:rFonts w:eastAsiaTheme="majorEastAsia"/>
+          <w:color w:val="000000"/>
+        </w:rPr>
+        <w:t> </w:t>
+      </w:r>
+      <w:r>
+        <w:rPr>
+          <w:rStyle w:val="Strong"/>
+          <w:rFonts w:eastAsiaTheme="majorEastAsia"/>
+          <w:b w:val="0"/>
+          <w:bCs w:val="0"/>
+          <w:color w:val="000000"/>
+        </w:rPr>
+        <w:t>untouched 200-example expert test set</w:t>
+      </w:r>
+      <w:r>
+        <w:rPr>
+          <w:color w:val="000000"/>
+        </w:rPr>
+        <w:t>.</w:t>
+      </w:r>
+    </w:p>
+    <w:p>
+      <w:pPr>
+        <w:pStyle w:val="NormalWeb"/>
+        <w:rPr>
+          <w:color w:val="000000"/>
+        </w:rPr>
+      </w:pPr>
+      <w:r>
+        <w:rPr>
+          <w:color w:val="000000"/>
+        </w:rPr>
+        <w:t>The first was a</w:t>
+      </w:r>
+      <w:r>
+        <w:rPr>
+          <w:rStyle w:val="apple-converted-space"/>
+          <w:rFonts w:eastAsiaTheme="majorEastAsia"/>
+          <w:color w:val="000000"/>
+        </w:rPr>
+        <w:t> </w:t>
+      </w:r>
+      <w:r>
+        <w:rPr>
+          <w:rStyle w:val="Strong"/>
+          <w:rFonts w:eastAsiaTheme="majorEastAsia"/>
+          <w:b w:val="0"/>
+          <w:bCs w:val="0"/>
+          <w:color w:val="000000"/>
+        </w:rPr>
+        <w:t>simple strong baseline</w:t>
+      </w:r>
+      <w:r>
+        <w:rPr>
+          <w:color w:val="000000"/>
+        </w:rPr>
+        <w:t>: weak-label warm-start, followed by direct three-class fine-tuning on</w:t>
+      </w:r>
+      <w:r>
+        <w:rPr>
+          <w:rStyle w:val="apple-converted-space"/>
+          <w:rFonts w:eastAsiaTheme="majorEastAsia"/>
+          <w:color w:val="000000"/>
+        </w:rPr>
+        <w:t> </w:t>
+      </w:r>
+      <w:r>
+        <w:rPr>
+          <w:rStyle w:val="Strong"/>
+          <w:rFonts w:eastAsiaTheme="majorEastAsia"/>
+          <w:b w:val="0"/>
+          <w:bCs w:val="0"/>
+          <w:color w:val="000000"/>
+        </w:rPr>
+        <w:t>700 expert training examples</w:t>
+      </w:r>
+      <w:r>
+        <w:rPr>
+          <w:rStyle w:val="apple-converted-space"/>
+          <w:rFonts w:eastAsiaTheme="majorEastAsia"/>
+          <w:color w:val="000000"/>
+        </w:rPr>
+        <w:t> </w:t>
+      </w:r>
+      <w:r>
+        <w:rPr>
+          <w:color w:val="000000"/>
+        </w:rPr>
+        <w:t>with</w:t>
+      </w:r>
+      <w:r>
+        <w:rPr>
+          <w:rStyle w:val="apple-converted-space"/>
+          <w:rFonts w:eastAsiaTheme="majorEastAsia"/>
+          <w:color w:val="000000"/>
+        </w:rPr>
+        <w:t> </w:t>
+      </w:r>
+      <w:r>
+        <w:rPr>
+          <w:rStyle w:val="Strong"/>
+          <w:rFonts w:eastAsiaTheme="majorEastAsia"/>
+          <w:b w:val="0"/>
+          <w:bCs w:val="0"/>
+          <w:color w:val="000000"/>
+        </w:rPr>
+        <w:t>100 expert validation examples</w:t>
+      </w:r>
+      <w:r>
+        <w:rPr>
+          <w:color w:val="000000"/>
+        </w:rPr>
+        <w:t>, and no use of the unlabelled pool. This tests whether a simple pipeline using more clean expert labels can outperform more elaborate semi-supervised methods.</w:t>
+      </w:r>
+    </w:p>
+    <w:p>
+      <w:pPr>
+        <w:pStyle w:val="NormalWeb"/>
+        <w:rPr>
+          <w:color w:val="000000"/>
+        </w:rPr>
+      </w:pPr>
+      <w:r>
+        <w:rPr>
+          <w:color w:val="000000"/>
+        </w:rPr>
+        <w:t>The second was a</w:t>
+      </w:r>
+      <w:r>
+        <w:rPr>
+          <w:rStyle w:val="apple-converted-space"/>
+          <w:rFonts w:eastAsiaTheme="majorEastAsia"/>
+          <w:color w:val="000000"/>
+        </w:rPr>
+        <w:t> </w:t>
+      </w:r>
+      <w:r>
+        <w:rPr>
+          <w:rStyle w:val="Strong"/>
+          <w:rFonts w:eastAsiaTheme="majorEastAsia"/>
+          <w:b w:val="0"/>
+          <w:bCs w:val="0"/>
+          <w:color w:val="000000"/>
+        </w:rPr>
+        <w:t>fair expert-only ablation</w:t>
+      </w:r>
+      <w:r>
+        <w:rPr>
+          <w:color w:val="000000"/>
+        </w:rPr>
+        <w:t>: weak-label warm-start, then three-class training on</w:t>
+      </w:r>
+      <w:r>
+        <w:rPr>
+          <w:rStyle w:val="apple-converted-space"/>
+          <w:rFonts w:eastAsiaTheme="majorEastAsia"/>
+          <w:color w:val="000000"/>
+        </w:rPr>
+        <w:t> </w:t>
+      </w:r>
+      <w:r>
+        <w:rPr>
+          <w:rStyle w:val="Strong"/>
+          <w:rFonts w:eastAsiaTheme="majorEastAsia"/>
+          <w:b w:val="0"/>
+          <w:bCs w:val="0"/>
+          <w:color w:val="000000"/>
+        </w:rPr>
+        <w:t>500 expert train</w:t>
+      </w:r>
+      <w:r>
+        <w:rPr>
+          <w:rStyle w:val="apple-converted-space"/>
+          <w:rFonts w:eastAsiaTheme="majorEastAsia"/>
+          <w:color w:val="000000"/>
+        </w:rPr>
+        <w:t> </w:t>
+      </w:r>
+      <w:r>
+        <w:rPr>
+          <w:color w:val="000000"/>
+        </w:rPr>
+        <w:t>and</w:t>
+      </w:r>
+      <w:r>
+        <w:rPr>
+          <w:rStyle w:val="apple-converted-space"/>
+          <w:rFonts w:eastAsiaTheme="majorEastAsia"/>
+          <w:color w:val="000000"/>
+        </w:rPr>
+        <w:t> </w:t>
+      </w:r>
+      <w:r>
+        <w:rPr>
+          <w:rStyle w:val="Strong"/>
+          <w:rFonts w:eastAsiaTheme="majorEastAsia"/>
+          <w:b w:val="0"/>
+          <w:bCs w:val="0"/>
+          <w:color w:val="000000"/>
+        </w:rPr>
+        <w:t xml:space="preserve">100 expert </w:t>
+      </w:r>
+      <w:proofErr w:type="gramStart"/>
+      <w:r>
+        <w:rPr>
+          <w:rStyle w:val="Strong"/>
+          <w:rFonts w:eastAsiaTheme="majorEastAsia"/>
+          <w:b w:val="0"/>
+          <w:bCs w:val="0"/>
+          <w:color w:val="000000"/>
+        </w:rPr>
+        <w:t>validation</w:t>
+      </w:r>
+      <w:proofErr w:type="gramEnd"/>
+      <w:r>
+        <w:rPr>
+          <w:color w:val="000000"/>
+        </w:rPr>
+        <w:t>, followed by a final</w:t>
+      </w:r>
+      <w:r>
+        <w:rPr>
+          <w:rStyle w:val="apple-converted-space"/>
+          <w:rFonts w:eastAsiaTheme="majorEastAsia"/>
+          <w:color w:val="000000"/>
+        </w:rPr>
+        <w:t> </w:t>
+      </w:r>
+      <w:r>
+        <w:rPr>
+          <w:rStyle w:val="Strong"/>
+          <w:rFonts w:eastAsiaTheme="majorEastAsia"/>
+          <w:b w:val="0"/>
+          <w:bCs w:val="0"/>
+          <w:color w:val="000000"/>
+        </w:rPr>
+        <w:t>expert-only polish</w:t>
+      </w:r>
+      <w:r>
+        <w:rPr>
+          <w:rStyle w:val="apple-converted-space"/>
+          <w:rFonts w:eastAsiaTheme="majorEastAsia"/>
+          <w:color w:val="000000"/>
+        </w:rPr>
+        <w:t> </w:t>
+      </w:r>
+      <w:r>
+        <w:rPr>
+          <w:color w:val="000000"/>
+        </w:rPr>
+        <w:t>on a separate set of</w:t>
+      </w:r>
+      <w:r>
+        <w:rPr>
+          <w:rStyle w:val="apple-converted-space"/>
+          <w:rFonts w:eastAsiaTheme="majorEastAsia"/>
+          <w:color w:val="000000"/>
+        </w:rPr>
+        <w:t> </w:t>
+      </w:r>
+      <w:r>
+        <w:rPr>
+          <w:rStyle w:val="Strong"/>
+          <w:rFonts w:eastAsiaTheme="majorEastAsia"/>
+          <w:b w:val="0"/>
+          <w:bCs w:val="0"/>
+          <w:color w:val="000000"/>
+        </w:rPr>
+        <w:t>200 expert examples</w:t>
+      </w:r>
+      <w:r>
+        <w:rPr>
+          <w:color w:val="000000"/>
+        </w:rPr>
+        <w:t>. This matched the supervision schedule of the advanced route while excluding pseudo-labelling, so any performance difference could be attributed to the pseudo-label stage rather than a different data budget.</w:t>
+      </w:r>
+    </w:p>
+    <w:p>
+      <w:pPr>
+        <w:pStyle w:val="NormalWeb"/>
+        <w:rPr>
+          <w:color w:val="000000"/>
+        </w:rPr>
+      </w:pPr>
+      <w:r>
+        <w:rPr>
+          <w:color w:val="000000"/>
+        </w:rPr>
+        <w:t>The third was the</w:t>
+      </w:r>
+      <w:r>
+        <w:rPr>
+          <w:rStyle w:val="apple-converted-space"/>
+          <w:rFonts w:eastAsiaTheme="majorEastAsia"/>
+          <w:color w:val="000000"/>
+        </w:rPr>
+        <w:t> </w:t>
+      </w:r>
+      <w:r>
+        <w:rPr>
+          <w:rStyle w:val="Strong"/>
+          <w:rFonts w:eastAsiaTheme="majorEastAsia"/>
+          <w:b w:val="0"/>
+          <w:bCs w:val="0"/>
+          <w:color w:val="000000"/>
+        </w:rPr>
+        <w:t>full semi-supervised</w:t>
+      </w:r>
+      <w:r>
+        <w:rPr>
+          <w:rStyle w:val="Strong"/>
+          <w:rFonts w:eastAsiaTheme="majorEastAsia"/>
+          <w:b w:val="0"/>
+          <w:bCs w:val="0"/>
+          <w:color w:val="000000"/>
+        </w:rPr>
+        <w:t xml:space="preserve"> advanced</w:t>
+      </w:r>
+      <w:r>
+        <w:rPr>
+          <w:rStyle w:val="Strong"/>
+          <w:rFonts w:eastAsiaTheme="majorEastAsia"/>
+          <w:b w:val="0"/>
+          <w:bCs w:val="0"/>
+          <w:color w:val="000000"/>
+        </w:rPr>
+        <w:t xml:space="preserve"> pipeline</w:t>
+      </w:r>
+      <w:r>
+        <w:rPr>
+          <w:color w:val="000000"/>
+        </w:rPr>
+        <w:t>. Starting from the same weak-label warm-start, we trained a three-class expert teacher on</w:t>
+      </w:r>
+      <w:r>
+        <w:rPr>
+          <w:rStyle w:val="apple-converted-space"/>
+          <w:rFonts w:eastAsiaTheme="majorEastAsia"/>
+          <w:color w:val="000000"/>
+        </w:rPr>
+        <w:t> </w:t>
+      </w:r>
+      <w:r>
+        <w:rPr>
+          <w:rStyle w:val="Strong"/>
+          <w:rFonts w:eastAsiaTheme="majorEastAsia"/>
+          <w:b w:val="0"/>
+          <w:bCs w:val="0"/>
+          <w:color w:val="000000"/>
+        </w:rPr>
+        <w:t>500 expert train</w:t>
+      </w:r>
+      <w:r>
+        <w:rPr>
+          <w:rStyle w:val="apple-converted-space"/>
+          <w:rFonts w:eastAsiaTheme="majorEastAsia"/>
+          <w:color w:val="000000"/>
+        </w:rPr>
+        <w:t> </w:t>
+      </w:r>
+      <w:r>
+        <w:rPr>
+          <w:color w:val="000000"/>
+        </w:rPr>
+        <w:t>and</w:t>
+      </w:r>
+      <w:r>
+        <w:rPr>
+          <w:rStyle w:val="apple-converted-space"/>
+          <w:rFonts w:eastAsiaTheme="majorEastAsia"/>
+          <w:color w:val="000000"/>
+        </w:rPr>
+        <w:t> </w:t>
+      </w:r>
+      <w:r>
+        <w:rPr>
+          <w:rStyle w:val="Strong"/>
+          <w:rFonts w:eastAsiaTheme="majorEastAsia"/>
+          <w:b w:val="0"/>
+          <w:bCs w:val="0"/>
+          <w:color w:val="000000"/>
+        </w:rPr>
+        <w:t xml:space="preserve">100 expert </w:t>
+      </w:r>
+      <w:proofErr w:type="gramStart"/>
+      <w:r>
+        <w:rPr>
+          <w:rStyle w:val="Strong"/>
+          <w:rFonts w:eastAsiaTheme="majorEastAsia"/>
+          <w:b w:val="0"/>
+          <w:bCs w:val="0"/>
+          <w:color w:val="000000"/>
+        </w:rPr>
+        <w:t>validation</w:t>
+      </w:r>
+      <w:proofErr w:type="gramEnd"/>
+      <w:r>
+        <w:rPr>
+          <w:color w:val="000000"/>
+        </w:rPr>
+        <w:t>. We then applied</w:t>
+      </w:r>
+      <w:r>
+        <w:rPr>
+          <w:rStyle w:val="apple-converted-space"/>
+          <w:rFonts w:eastAsiaTheme="majorEastAsia"/>
+          <w:color w:val="000000"/>
+        </w:rPr>
+        <w:t> </w:t>
+      </w:r>
+      <w:r>
+        <w:rPr>
+          <w:rStyle w:val="Strong"/>
+          <w:rFonts w:eastAsiaTheme="majorEastAsia"/>
+          <w:b w:val="0"/>
+          <w:bCs w:val="0"/>
+          <w:color w:val="000000"/>
+        </w:rPr>
+        <w:t>temperature scaling</w:t>
+      </w:r>
+      <w:r>
+        <w:rPr>
+          <w:rStyle w:val="apple-converted-space"/>
+          <w:rFonts w:eastAsiaTheme="majorEastAsia"/>
+          <w:color w:val="000000"/>
+        </w:rPr>
+        <w:t> </w:t>
+      </w:r>
+      <w:r>
+        <w:rPr>
+          <w:color w:val="000000"/>
+        </w:rPr>
+        <w:t xml:space="preserve">on the 100-example validation split so that pseudo-labelling decisions were based on calibrated probabilities rather than raw </w:t>
+      </w:r>
+      <w:proofErr w:type="spellStart"/>
+      <w:r>
+        <w:rPr>
+          <w:color w:val="000000"/>
+        </w:rPr>
+        <w:t>softmax</w:t>
+      </w:r>
+      <w:proofErr w:type="spellEnd"/>
+      <w:r>
+        <w:rPr>
+          <w:color w:val="000000"/>
+        </w:rPr>
+        <w:t xml:space="preserve"> scores. This teacher was used to pseudo-label an unlabelled pool of </w:t>
+      </w:r>
+      <w:r>
+        <w:rPr>
+          <w:rStyle w:val="Strong"/>
+          <w:rFonts w:eastAsiaTheme="majorEastAsia"/>
+          <w:b w:val="0"/>
+          <w:bCs w:val="0"/>
+          <w:color w:val="000000"/>
+        </w:rPr>
+        <w:t>examples</w:t>
+      </w:r>
+      <w:r>
+        <w:rPr>
+          <w:color w:val="000000"/>
+        </w:rPr>
+        <w:t>. To reduce confirmation bias and class drift, only</w:t>
+      </w:r>
+      <w:r>
+        <w:rPr>
+          <w:rStyle w:val="apple-converted-space"/>
+          <w:rFonts w:eastAsiaTheme="majorEastAsia"/>
+          <w:color w:val="000000"/>
+        </w:rPr>
+        <w:t> </w:t>
+      </w:r>
+      <w:r>
+        <w:rPr>
+          <w:rStyle w:val="Strong"/>
+          <w:rFonts w:eastAsiaTheme="majorEastAsia"/>
+          <w:b w:val="0"/>
+          <w:bCs w:val="0"/>
+          <w:color w:val="000000"/>
+        </w:rPr>
+        <w:t>high-confidence pseudo-labels</w:t>
+      </w:r>
+      <w:r>
+        <w:rPr>
+          <w:rStyle w:val="apple-converted-space"/>
+          <w:rFonts w:eastAsiaTheme="majorEastAsia"/>
+          <w:color w:val="000000"/>
+        </w:rPr>
+        <w:t> </w:t>
+      </w:r>
+      <w:r>
+        <w:rPr>
+          <w:color w:val="000000"/>
+        </w:rPr>
+        <w:t>were retained, using</w:t>
+      </w:r>
+      <w:r>
+        <w:rPr>
+          <w:rStyle w:val="apple-converted-space"/>
+          <w:rFonts w:eastAsiaTheme="majorEastAsia"/>
+          <w:color w:val="000000"/>
+        </w:rPr>
+        <w:t> </w:t>
+      </w:r>
+      <w:r>
+        <w:rPr>
+          <w:rStyle w:val="Strong"/>
+          <w:rFonts w:eastAsiaTheme="majorEastAsia"/>
+          <w:b w:val="0"/>
+          <w:bCs w:val="0"/>
+          <w:color w:val="000000"/>
+        </w:rPr>
+        <w:t>class-aware selection</w:t>
+      </w:r>
+      <w:r>
+        <w:rPr>
+          <w:rStyle w:val="apple-converted-space"/>
+          <w:rFonts w:eastAsiaTheme="majorEastAsia"/>
+          <w:color w:val="000000"/>
+        </w:rPr>
+        <w:t> </w:t>
+      </w:r>
+      <w:r>
+        <w:rPr>
+          <w:color w:val="000000"/>
+        </w:rPr>
+        <w:t>rather than a single global threshold. The model was then trained on the combination of the</w:t>
+      </w:r>
+      <w:r>
+        <w:rPr>
+          <w:rStyle w:val="apple-converted-space"/>
+          <w:rFonts w:eastAsiaTheme="majorEastAsia"/>
+          <w:color w:val="000000"/>
+        </w:rPr>
+        <w:t> </w:t>
+      </w:r>
+      <w:r>
+        <w:rPr>
+          <w:rStyle w:val="Strong"/>
+          <w:rFonts w:eastAsiaTheme="majorEastAsia"/>
+          <w:b w:val="0"/>
+          <w:bCs w:val="0"/>
+          <w:color w:val="000000"/>
+        </w:rPr>
+        <w:t>500 expert examples</w:t>
+      </w:r>
+      <w:r>
+        <w:rPr>
+          <w:rStyle w:val="apple-converted-space"/>
+          <w:rFonts w:eastAsiaTheme="majorEastAsia"/>
+          <w:color w:val="000000"/>
+        </w:rPr>
+        <w:t> </w:t>
+      </w:r>
+      <w:r>
+        <w:rPr>
+          <w:color w:val="000000"/>
+        </w:rPr>
+        <w:t>and the selected pseudo-labelled examples, followed by a final</w:t>
+      </w:r>
+      <w:r>
+        <w:rPr>
+          <w:rStyle w:val="apple-converted-space"/>
+          <w:rFonts w:eastAsiaTheme="majorEastAsia"/>
+          <w:color w:val="000000"/>
+        </w:rPr>
+        <w:t> </w:t>
+      </w:r>
+      <w:r>
+        <w:rPr>
+          <w:rStyle w:val="Strong"/>
+          <w:rFonts w:eastAsiaTheme="majorEastAsia"/>
+          <w:b w:val="0"/>
+          <w:bCs w:val="0"/>
+          <w:color w:val="000000"/>
+        </w:rPr>
+        <w:t>expert-only polish</w:t>
+      </w:r>
+      <w:r>
+        <w:rPr>
+          <w:rStyle w:val="apple-converted-space"/>
+          <w:rFonts w:eastAsiaTheme="majorEastAsia"/>
+          <w:color w:val="000000"/>
+        </w:rPr>
+        <w:t> </w:t>
+      </w:r>
+      <w:r>
+        <w:rPr>
+          <w:color w:val="000000"/>
+        </w:rPr>
+        <w:t>on the held-back</w:t>
+      </w:r>
+      <w:r>
+        <w:rPr>
+          <w:rStyle w:val="apple-converted-space"/>
+          <w:rFonts w:eastAsiaTheme="majorEastAsia"/>
+          <w:color w:val="000000"/>
+        </w:rPr>
+        <w:t> </w:t>
+      </w:r>
+      <w:r>
+        <w:rPr>
+          <w:rStyle w:val="Strong"/>
+          <w:rFonts w:eastAsiaTheme="majorEastAsia"/>
+          <w:b w:val="0"/>
+          <w:bCs w:val="0"/>
+          <w:color w:val="000000"/>
+        </w:rPr>
+        <w:t>200 expert examples</w:t>
+      </w:r>
+      <w:r>
+        <w:rPr>
+          <w:color w:val="000000"/>
+        </w:rPr>
+        <w:t>.</w:t>
+      </w:r>
+    </w:p>
+    <w:p>
+      <w:pPr>
+        <w:pStyle w:val="Heading3"/>
+        <w:rPr>
+          <w:rFonts w:cs="Times New Roman"/>
+          <w:b/>
+          <w:bCs/>
+          <w:color w:val="000000"/>
+        </w:rPr>
+      </w:pPr>
+      <w:r>
+        <w:rPr>
+          <w:rFonts w:cs="Times New Roman"/>
+          <w:b/>
+          <w:bCs/>
+          <w:color w:val="000000"/>
+        </w:rPr>
+        <w:t>Experimental design and leakage control</w:t>
+      </w:r>
+    </w:p>
+    <w:p>
+      <w:pPr>
+        <w:pStyle w:val="NormalWeb"/>
+        <w:rPr>
+          <w:i/>
+          <w:iCs/>
+          <w:color w:val="000000"/>
+        </w:rPr>
+      </w:pPr>
+      <w:r>
+        <w:rPr>
+          <w:i/>
+          <w:iCs/>
+          <w:color w:val="000000"/>
+        </w:rPr>
+        <w:t>{</w:t>
+      </w:r>
+      <w:r>
+        <w:rPr>
+          <w:i/>
+          <w:iCs/>
+          <w:color w:val="000000"/>
+        </w:rPr>
+        <w:t>The overall design followed a staged scientific method. We first optimised a strong supervised classifier, then tested one proposed improvement at a time</w:t>
+      </w:r>
+      <w:r>
+        <w:rPr>
+          <w:i/>
+          <w:iCs/>
+          <w:color w:val="000000"/>
+        </w:rPr>
+        <w:t xml:space="preserve"> to keep</w:t>
+      </w:r>
+      <w:r>
+        <w:rPr>
+          <w:i/>
+          <w:iCs/>
+          <w:color w:val="000000"/>
+        </w:rPr>
+        <w:t xml:space="preserve"> the experimental logic interpretable and avoided changing multiple major components simultaneously.</w:t>
+      </w:r>
+    </w:p>
+    <w:p>
+      <w:pPr>
+        <w:pStyle w:val="NormalWeb"/>
+        <w:rPr>
+          <w:i/>
+          <w:iCs/>
+          <w:color w:val="EE0000"/>
+        </w:rPr>
+      </w:pPr>
+      <w:r>
+        <w:rPr>
+          <w:i/>
+          <w:iCs/>
+          <w:color w:val="000000"/>
+        </w:rPr>
+        <w:lastRenderedPageBreak/>
+        <w:t>The downstream comparison was designed specifically to avoid leakage. The</w:t>
+      </w:r>
+      <w:r>
+        <w:rPr>
+          <w:rStyle w:val="apple-converted-space"/>
+          <w:rFonts w:eastAsiaTheme="majorEastAsia"/>
+          <w:i/>
+          <w:iCs/>
+          <w:color w:val="000000"/>
+        </w:rPr>
+        <w:t> </w:t>
+      </w:r>
+      <w:r>
+        <w:rPr>
+          <w:rStyle w:val="Strong"/>
+          <w:rFonts w:eastAsiaTheme="majorEastAsia"/>
+          <w:b w:val="0"/>
+          <w:bCs w:val="0"/>
+          <w:i/>
+          <w:iCs/>
+          <w:color w:val="000000"/>
+        </w:rPr>
+        <w:t xml:space="preserve">200 final </w:t>
+      </w:r>
+      <w:r>
+        <w:rPr>
+          <w:rStyle w:val="Strong"/>
+          <w:rFonts w:eastAsiaTheme="majorEastAsia"/>
+          <w:b w:val="0"/>
+          <w:bCs w:val="0"/>
+          <w:i/>
+          <w:iCs/>
+          <w:color w:val="000000"/>
+        </w:rPr>
+        <w:t xml:space="preserve">expert </w:t>
+      </w:r>
+      <w:r>
+        <w:rPr>
+          <w:rStyle w:val="Strong"/>
+          <w:rFonts w:eastAsiaTheme="majorEastAsia"/>
+          <w:b w:val="0"/>
+          <w:bCs w:val="0"/>
+          <w:i/>
+          <w:iCs/>
+          <w:color w:val="000000"/>
+        </w:rPr>
+        <w:t>test examples</w:t>
+      </w:r>
+      <w:r>
+        <w:rPr>
+          <w:rStyle w:val="apple-converted-space"/>
+          <w:rFonts w:eastAsiaTheme="majorEastAsia"/>
+          <w:i/>
+          <w:iCs/>
+          <w:color w:val="000000"/>
+        </w:rPr>
+        <w:t> </w:t>
+      </w:r>
+      <w:r>
+        <w:rPr>
+          <w:i/>
+          <w:iCs/>
+          <w:color w:val="000000"/>
+        </w:rPr>
+        <w:t>were fixed in advance and never used for training, calibration, threshold selection, pseudo-labelling, or model selection.</w:t>
+      </w:r>
+      <w:r>
+        <w:rPr>
+          <w:i/>
+          <w:iCs/>
+          <w:color w:val="000000"/>
+        </w:rPr>
+        <w:t xml:space="preserve"> The final three models/ablations were then compared on this test set.</w:t>
+      </w:r>
+      <w:r>
+        <w:rPr>
+          <w:i/>
+          <w:iCs/>
+          <w:color w:val="000000"/>
+        </w:rPr>
+        <w:t xml:space="preserve"> </w:t>
+      </w:r>
+    </w:p>
+    <w:p>
+      <w:pPr>
+        <w:pStyle w:val="NormalWeb"/>
+        <w:rPr>
+          <w:color w:val="000000"/>
+        </w:rPr>
+      </w:pPr>
+      <w:r>
+        <w:rPr>
+          <w:i/>
+          <w:iCs/>
+          <w:color w:val="000000"/>
+        </w:rPr>
+        <w:t>Across all final comparisons,</w:t>
+      </w:r>
+      <w:r>
+        <w:rPr>
+          <w:rStyle w:val="apple-converted-space"/>
+          <w:rFonts w:eastAsiaTheme="majorEastAsia"/>
+          <w:i/>
+          <w:iCs/>
+          <w:color w:val="000000"/>
+        </w:rPr>
+        <w:t> </w:t>
+      </w:r>
+      <w:r>
+        <w:rPr>
+          <w:rStyle w:val="Strong"/>
+          <w:rFonts w:eastAsiaTheme="majorEastAsia"/>
+          <w:b w:val="0"/>
+          <w:bCs w:val="0"/>
+          <w:i/>
+          <w:iCs/>
+          <w:color w:val="000000"/>
+        </w:rPr>
+        <w:t>macro F1</w:t>
+      </w:r>
+      <w:r>
+        <w:rPr>
+          <w:rStyle w:val="apple-converted-space"/>
+          <w:rFonts w:eastAsiaTheme="majorEastAsia"/>
+          <w:i/>
+          <w:iCs/>
+          <w:color w:val="000000"/>
+        </w:rPr>
+        <w:t> </w:t>
+      </w:r>
+      <w:r>
+        <w:rPr>
+          <w:i/>
+          <w:iCs/>
+          <w:color w:val="000000"/>
+        </w:rPr>
+        <w:t>was the primary metric because class balance, especially on</w:t>
+      </w:r>
+      <w:r>
+        <w:rPr>
+          <w:rStyle w:val="apple-converted-space"/>
+          <w:rFonts w:eastAsiaTheme="majorEastAsia"/>
+          <w:i/>
+          <w:iCs/>
+          <w:color w:val="000000"/>
+        </w:rPr>
+        <w:t> </w:t>
+      </w:r>
+      <w:r>
+        <w:rPr>
+          <w:rStyle w:val="HTMLCode"/>
+          <w:rFonts w:ascii="Times New Roman" w:eastAsiaTheme="majorEastAsia" w:hAnsi="Times New Roman" w:cs="Times New Roman"/>
+          <w:i/>
+          <w:iCs/>
+          <w:color w:val="000000"/>
+          <w:sz w:val="24"/>
+          <w:szCs w:val="24"/>
+        </w:rPr>
+        <w:t>maybe</w:t>
+      </w:r>
+      <w:r>
+        <w:rPr>
+          <w:i/>
+          <w:iCs/>
+          <w:color w:val="000000"/>
+        </w:rPr>
+        <w:t xml:space="preserve">, mattered more than raw accuracy. Accuracy was reported as a secondary metric. Our final hypothesis </w:t>
+      </w:r>
+      <w:r>
+        <w:rPr>
+          <w:i/>
+          <w:iCs/>
+          <w:color w:val="000000"/>
+        </w:rPr>
+        <w:t xml:space="preserve">for </w:t>
+      </w:r>
+      <w:proofErr w:type="spellStart"/>
+      <w:r>
+        <w:rPr>
+          <w:i/>
+          <w:iCs/>
+          <w:color w:val="000000"/>
+        </w:rPr>
+        <w:t>BiomedClinicalBERT</w:t>
+      </w:r>
+      <w:proofErr w:type="spellEnd"/>
+      <w:r>
+        <w:rPr>
+          <w:i/>
+          <w:iCs/>
+          <w:color w:val="000000"/>
+        </w:rPr>
+        <w:t xml:space="preserve"> </w:t>
+      </w:r>
+      <w:r>
+        <w:rPr>
+          <w:i/>
+          <w:iCs/>
+          <w:color w:val="000000"/>
+        </w:rPr>
+        <w:t>was that the</w:t>
+      </w:r>
+      <w:r>
+        <w:rPr>
+          <w:rStyle w:val="apple-converted-space"/>
+          <w:rFonts w:eastAsiaTheme="majorEastAsia"/>
+          <w:i/>
+          <w:iCs/>
+          <w:color w:val="000000"/>
+        </w:rPr>
+        <w:t> </w:t>
+      </w:r>
+      <w:r>
+        <w:rPr>
+          <w:rStyle w:val="Strong"/>
+          <w:rFonts w:eastAsiaTheme="majorEastAsia"/>
+          <w:b w:val="0"/>
+          <w:bCs w:val="0"/>
+          <w:i/>
+          <w:iCs/>
+          <w:color w:val="000000"/>
+        </w:rPr>
+        <w:t>full semi-</w:t>
+      </w:r>
+      <w:proofErr w:type="gramStart"/>
+      <w:r>
+        <w:rPr>
+          <w:rStyle w:val="Strong"/>
+          <w:rFonts w:eastAsiaTheme="majorEastAsia"/>
+          <w:b w:val="0"/>
+          <w:bCs w:val="0"/>
+          <w:i/>
+          <w:iCs/>
+          <w:color w:val="000000"/>
+        </w:rPr>
+        <w:t xml:space="preserve">supervised </w:t>
+      </w:r>
+      <w:r>
+        <w:rPr>
+          <w:rStyle w:val="Strong"/>
+          <w:rFonts w:eastAsiaTheme="majorEastAsia"/>
+          <w:b w:val="0"/>
+          <w:bCs w:val="0"/>
+          <w:i/>
+          <w:iCs/>
+          <w:color w:val="000000"/>
+        </w:rPr>
+        <w:t xml:space="preserve"> advanced</w:t>
+      </w:r>
+      <w:proofErr w:type="gramEnd"/>
+      <w:r>
+        <w:rPr>
+          <w:rStyle w:val="Strong"/>
+          <w:rFonts w:eastAsiaTheme="majorEastAsia"/>
+          <w:b w:val="0"/>
+          <w:bCs w:val="0"/>
+          <w:i/>
+          <w:iCs/>
+          <w:color w:val="000000"/>
+        </w:rPr>
+        <w:t xml:space="preserve"> </w:t>
+      </w:r>
+      <w:r>
+        <w:rPr>
+          <w:rStyle w:val="Strong"/>
+          <w:rFonts w:eastAsiaTheme="majorEastAsia"/>
+          <w:b w:val="0"/>
+          <w:bCs w:val="0"/>
+          <w:i/>
+          <w:iCs/>
+          <w:color w:val="000000"/>
+        </w:rPr>
+        <w:t>pipeline</w:t>
+      </w:r>
+      <w:r>
+        <w:rPr>
+          <w:rStyle w:val="apple-converted-space"/>
+          <w:rFonts w:eastAsiaTheme="majorEastAsia"/>
+          <w:i/>
+          <w:iCs/>
+          <w:color w:val="000000"/>
+        </w:rPr>
+        <w:t> </w:t>
+      </w:r>
+      <w:r>
+        <w:rPr>
+          <w:i/>
+          <w:iCs/>
+          <w:color w:val="000000"/>
+        </w:rPr>
+        <w:t>would perform best, because it combines coarse adaptation from</w:t>
+      </w:r>
+      <w:r>
+        <w:rPr>
+          <w:rStyle w:val="apple-converted-space"/>
+          <w:rFonts w:eastAsiaTheme="majorEastAsia"/>
+          <w:i/>
+          <w:iCs/>
+          <w:color w:val="000000"/>
+        </w:rPr>
+        <w:t> </w:t>
+      </w:r>
+      <w:r>
+        <w:rPr>
+          <w:rStyle w:val="Strong"/>
+          <w:rFonts w:eastAsiaTheme="majorEastAsia"/>
+          <w:b w:val="0"/>
+          <w:bCs w:val="0"/>
+          <w:i/>
+          <w:iCs/>
+          <w:color w:val="000000"/>
+        </w:rPr>
+        <w:t>200k weak labels</w:t>
+      </w:r>
+      <w:r>
+        <w:rPr>
+          <w:i/>
+          <w:iCs/>
+          <w:color w:val="000000"/>
+        </w:rPr>
+        <w:t>, expert correction from</w:t>
+      </w:r>
+      <w:r>
+        <w:rPr>
+          <w:rStyle w:val="apple-converted-space"/>
+          <w:rFonts w:eastAsiaTheme="majorEastAsia"/>
+          <w:i/>
+          <w:iCs/>
+          <w:color w:val="000000"/>
+        </w:rPr>
+        <w:t> </w:t>
+      </w:r>
+      <w:r>
+        <w:rPr>
+          <w:rStyle w:val="Strong"/>
+          <w:rFonts w:eastAsiaTheme="majorEastAsia"/>
+          <w:b w:val="0"/>
+          <w:bCs w:val="0"/>
+          <w:i/>
+          <w:iCs/>
+          <w:color w:val="000000"/>
+        </w:rPr>
+        <w:t>500 clean labels</w:t>
+      </w:r>
+      <w:r>
+        <w:rPr>
+          <w:i/>
+          <w:iCs/>
+          <w:color w:val="000000"/>
+        </w:rPr>
+        <w:t>, selective expansion through calibrated</w:t>
+      </w:r>
+      <w:r>
+        <w:rPr>
+          <w:i/>
+          <w:iCs/>
+          <w:color w:val="000000"/>
+        </w:rPr>
+        <w:t xml:space="preserve"> </w:t>
+      </w:r>
+      <w:r>
+        <w:rPr>
+          <w:i/>
+          <w:iCs/>
+          <w:color w:val="000000"/>
+        </w:rPr>
+        <w:t>high-confidence and class-aware</w:t>
+      </w:r>
+      <w:r>
+        <w:rPr>
+          <w:i/>
+          <w:iCs/>
+          <w:color w:val="000000"/>
+        </w:rPr>
+        <w:t xml:space="preserve"> pseudo-labelling on</w:t>
+      </w:r>
+      <w:r>
+        <w:rPr>
+          <w:rStyle w:val="apple-converted-space"/>
+          <w:rFonts w:eastAsiaTheme="majorEastAsia"/>
+          <w:i/>
+          <w:iCs/>
+          <w:color w:val="000000"/>
+        </w:rPr>
+        <w:t> </w:t>
+      </w:r>
+      <w:r>
+        <w:rPr>
+          <w:rStyle w:val="Strong"/>
+          <w:rFonts w:eastAsiaTheme="majorEastAsia"/>
+          <w:b w:val="0"/>
+          <w:bCs w:val="0"/>
+          <w:i/>
+          <w:iCs/>
+          <w:color w:val="000000"/>
+        </w:rPr>
+        <w:t xml:space="preserve">the </w:t>
+      </w:r>
+      <w:r>
+        <w:rPr>
+          <w:rStyle w:val="Strong"/>
+          <w:rFonts w:eastAsiaTheme="majorEastAsia"/>
+          <w:b w:val="0"/>
+          <w:bCs w:val="0"/>
+          <w:i/>
+          <w:iCs/>
+          <w:color w:val="000000"/>
+        </w:rPr>
+        <w:t>unlabelled examples</w:t>
+      </w:r>
+      <w:r>
+        <w:rPr>
+          <w:i/>
+          <w:iCs/>
+          <w:color w:val="000000"/>
+        </w:rPr>
+        <w:t>, and</w:t>
+      </w:r>
+      <w:r>
+        <w:rPr>
+          <w:i/>
+          <w:iCs/>
+          <w:color w:val="000000"/>
+        </w:rPr>
+        <w:t xml:space="preserve"> lastly,</w:t>
+      </w:r>
+      <w:r>
+        <w:rPr>
+          <w:i/>
+          <w:iCs/>
+          <w:color w:val="000000"/>
+        </w:rPr>
+        <w:t xml:space="preserve"> a final expert-only refinement stage</w:t>
+      </w:r>
+      <w:r>
+        <w:rPr>
+          <w:i/>
+          <w:iCs/>
+          <w:color w:val="000000"/>
+        </w:rPr>
+        <w:t>.</w:t>
+      </w:r>
+      <w:r>
+        <w:rPr>
+          <w:i/>
+          <w:iCs/>
+          <w:color w:val="000000"/>
+        </w:rPr>
+        <w:t>}</w:t>
+      </w:r>
+      <w:r>
+        <w:rPr>
+          <w:color w:val="000000"/>
+        </w:rPr>
+        <w:t xml:space="preserve"> – </w:t>
+      </w:r>
+      <w:r>
+        <w:rPr>
+          <w:color w:val="EE0000"/>
+        </w:rPr>
+        <w:t xml:space="preserve">This </w:t>
+      </w:r>
+      <w:r>
+        <w:rPr>
+          <w:color w:val="EE0000"/>
+        </w:rPr>
+        <w:t xml:space="preserve">final </w:t>
+      </w:r>
+      <w:r>
+        <w:rPr>
+          <w:color w:val="EE0000"/>
+        </w:rPr>
+        <w:t xml:space="preserve">bit is for everyone. </w:t>
+      </w:r>
+      <w:proofErr w:type="spellStart"/>
+      <w:r>
+        <w:rPr>
+          <w:color w:val="EE0000"/>
+        </w:rPr>
+        <w:t>Im</w:t>
+      </w:r>
+      <w:proofErr w:type="spellEnd"/>
+      <w:r>
+        <w:rPr>
+          <w:color w:val="EE0000"/>
+        </w:rPr>
+        <w:t xml:space="preserve"> thinking, at the start we have a “General Methods” of all the things we all did so we don’t repeat ourselves in our sections and then we frame it under the ‘scientific method’ and a ‘design of experiments’ approach. I reckon </w:t>
+      </w:r>
+      <w:proofErr w:type="spellStart"/>
+      <w:r>
+        <w:rPr>
+          <w:color w:val="EE0000"/>
+        </w:rPr>
+        <w:t>theyd</w:t>
+      </w:r>
+      <w:proofErr w:type="spellEnd"/>
+      <w:r>
+        <w:rPr>
+          <w:color w:val="EE0000"/>
+        </w:rPr>
+        <w:t xml:space="preserve"> eat that up!</w:t>
+      </w:r>
+    </w:p>
+    <w:p>
+      <w:pPr>
+        <w:rPr>
+          <w:b/>
+          <w:bCs/>
+          <w:sz w:val="40"/>
+          <w:szCs w:val="40"/>
+        </w:rPr>
+      </w:pPr>
+    </w:p>
+    <w:p>
+      <w:pPr>
+        <w:rPr>
+          <w:b/>
+          <w:bCs/>
+        </w:rPr>
+      </w:pPr>
+    </w:p>
+    <w:p>
+      <w:r>
+        <w:br w:type="page"/>
+      </w:r>
+    </w:p>
+    <w:p/>
+    <w:p>
+      <w:pPr>
         <w:pStyle w:val="Bibliography"/>
+      </w:pPr>
+      <w:r>
+        <w:t>REFERENCES</w:t>
+      </w:r>
+    </w:p>
+    <w:p>
+      <w:pPr>
+        <w:pStyle w:val="Bibliography"/>
         <w:rPr>
           <w:rFonts w:ascii="Aptos"/>
         </w:rPr>
       </w:pPr>
       <w:r>
+        <w:br/>
+      </w:r>
+      <w:r>
+        <w:fldChar w:fldCharType="begin"/>
+      </w:r>
+      <w:r>
+        <w:instrText xml:space="preserve"> ADDIN ZOTERO_BIBL {"uncited":[],"omitted":[],"custom":[]} CSL_BIBLIOGRAPHY </w:instrText>
+      </w:r>
+      <w:r>
+        <w:fldChar w:fldCharType="separate"/>
+      </w:r>
+      <w:r>
         <w:rPr>
           <w:rFonts w:ascii="Aptos"/>
         </w:rPr>
-        <w:t xml:space="preserve">Sakamoto, H., Watanabe, Y. and Satou, M. (2011) ‘Do preoperative statins reduce atrial fibrillation after coronary artery bypass grafting?’, </w:t>
+        <w:t xml:space="preserve">Jin, Q. </w:t>
       </w:r>
       <w:r>
         <w:rPr>
@@ -1526,13 +4393,141 @@
           <w:i/>
           <w:iCs/>
         </w:rPr>
+        <w:t>et al.</w:t>
+      </w:r>
+      <w:r>
+        <w:rPr>
+          <w:rFonts w:ascii="Aptos"/>
+        </w:rPr>
+        <w:t xml:space="preserve"> (2019) </w:t>
+      </w:r>
+      <w:r>
+        <w:rPr>
+          <w:rFonts w:ascii="Aptos"/>
+        </w:rPr>
+        <w:t>‘</w:t>
+      </w:r>
+      <w:r>
+        <w:rPr>
+          <w:rFonts w:ascii="Aptos"/>
+        </w:rPr>
+        <w:t>PubMedQA: A Dataset for Biomedical Research Question Answering</w:t>
+      </w:r>
+      <w:r>
+        <w:rPr>
+          <w:rFonts w:ascii="Aptos"/>
+        </w:rPr>
+        <w:t>’</w:t>
+      </w:r>
+      <w:r>
+        <w:rPr>
+          <w:rFonts w:ascii="Aptos"/>
+        </w:rPr>
+        <w:t xml:space="preserve">, in K. Inui et al. (eds) </w:t>
+      </w:r>
+      <w:r>
+        <w:rPr>
+          <w:rFonts w:ascii="Aptos"/>
+          <w:i/>
+          <w:iCs/>
+        </w:rPr>
+        <w:t>Proceedings of the 2019 Conference on Empirical Methods in Natural Language Processing and the 9th International Joint Conference on Natural Language Processing (EMNLP-IJCNLP)</w:t>
+      </w:r>
+      <w:r>
+        <w:rPr>
+          <w:rFonts w:ascii="Aptos"/>
+        </w:rPr>
+        <w:t xml:space="preserve">. </w:t>
+      </w:r>
+      <w:r>
+        <w:rPr>
+          <w:rFonts w:ascii="Aptos"/>
+          <w:i/>
+          <w:iCs/>
+        </w:rPr>
+        <w:t>EMNLP-IJCNLP 2019</w:t>
+      </w:r>
+      <w:r>
+        <w:rPr>
+          <w:rFonts w:ascii="Aptos"/>
+        </w:rPr>
+        <w:t>, Hong Kong, China: Association for Computational Linguistics, pp. 2567</w:t>
+      </w:r>
+      <w:r>
+        <w:rPr>
+          <w:rFonts w:ascii="Aptos"/>
+        </w:rPr>
+        <w:t>–</w:t>
+      </w:r>
+      <w:r>
+        <w:rPr>
+          <w:rFonts w:ascii="Aptos"/>
+        </w:rPr>
+        <w:t>2577. Available at: https://doi.org/10.18653/v1/D19-1259.</w:t>
+      </w:r>
+    </w:p>
+    <w:p>
+      <w:pPr>
+        <w:pStyle w:val="Bibliography"/>
+        <w:rPr>
+          <w:rFonts w:ascii="Aptos"/>
+        </w:rPr>
+      </w:pPr>
+      <w:r>
+        <w:rPr>
+          <w:rFonts w:ascii="Aptos"/>
+        </w:rPr>
+        <w:t xml:space="preserve">Sakamoto, H., Watanabe, Y. and Satou, M. (2011) </w:t>
+      </w:r>
+      <w:r>
+        <w:rPr>
+          <w:rFonts w:ascii="Aptos"/>
+        </w:rPr>
+        <w:t>‘</w:t>
+      </w:r>
+      <w:r>
+        <w:rPr>
+          <w:rFonts w:ascii="Aptos"/>
+        </w:rPr>
+        <w:t>Do preoperative statins reduce atrial fibrillation after coronary artery bypass grafting?</w:t>
+      </w:r>
+      <w:r>
+        <w:rPr>
+          <w:rFonts w:ascii="Aptos"/>
+        </w:rPr>
+        <w:t>’</w:t>
+      </w:r>
+      <w:r>
+        <w:rPr>
+          <w:rFonts w:ascii="Aptos"/>
+        </w:rPr>
+        <w:t xml:space="preserve">, </w:t>
+      </w:r>
+      <w:r>
+        <w:rPr>
+          <w:rFonts w:ascii="Aptos"/>
+          <w:i/>
+          <w:iCs/>
+        </w:rPr>
         <w:t>Annals of thoracic and cardiovascular surgery</w:t>
       </w:r>
       <w:r>
         <w:rPr>
           <w:rFonts w:ascii="Aptos"/>
         </w:rPr>
-        <w:t>, 17(4), pp. 376–382.</w:t>
+        <w:t>, 17(4), pp. 376</w:t>
+      </w:r>
+      <w:r>
+        <w:rPr>
+          <w:rFonts w:ascii="Aptos"/>
+        </w:rPr>
+        <w:t>–</w:t>
+      </w:r>
+      <w:r>
+        <w:rPr>
+          <w:rFonts w:ascii="Aptos"/>
+        </w:rPr>
+        <w:t>382.</w:t>
       </w:r>
     </w:p>
     <w:p>
@@ -1556,6 +4551,155 @@
 <file path=word/numbering.xml><?xml version="1.0" encoding="utf-8"?>
 <w:numbering xmlns:wpc="http://schemas.microsoft.com/office/word/2010/wordprocessingCanvas" xmlns:cx="http://schemas.microsoft.com/office/drawing/2014/chartex" xmlns:cx1="http://schemas.microsoft.com/office/drawing/2015/9/8/chartex" xmlns:cx2="http://schemas.microsoft.com/office/drawing/2015/10/21/chartex" xmlns:cx3="http://schemas.microsoft.com/office/drawing/2016/5/9/chartex" xmlns:cx4="http://schemas.microsoft.com/office/drawing/2016/5/10/chartex" xmlns:cx5="http://schemas.microsoft.com/office/drawing/2016/5/11/chartex" xmlns:cx6="http://schemas.microsoft.com/office/drawing/2016/5/12/chartex" xmlns:cx7="http://schemas.microsoft.com/office/drawing/2016/5/13/chartex" xmlns:cx8="http://schemas.microsoft.com/office/drawing/2016/5/14/chartex" xmlns:mc="http://schemas.openxmlformats.org/markup-compatibility/2006" xmlns:aink="http://schemas.microsoft.com/office/drawing/2016/ink" xmlns:am3d="http://schemas.microsoft.com/office/drawing/2017/model3d" xmlns:o="urn:schemas-microsoft-com:office:office" xmlns:oel="http://schemas.microsoft.com/office/2019/extlst" xmlns:r="http://schemas.openxmlformats.org/officeDocument/2006/relationships" xmlns:m="http://schemas.openxmlformats.org/officeDocument/2006/math" xmlns:v="urn:schemas-microsoft-com:vml" xmlns:wp14="http://schemas.microsoft.com/office/word/2010/wordprocessingDrawing" xmlns:wp="http://schemas.openxmlformats.org/drawingml/2006/wordprocessingDrawing" xmlns:w10="urn:schemas-microsoft-com:office:word" xmlns:w="http://schemas.openxmlformats.org/wordprocessingml/2006/main" xmlns:w14="http://schemas.microsoft.com/office/word/2010/wordml" xmlns:w15="http://schemas.microsoft.com/office/word/2012/wordml" xmlns:w16cex="http://schemas.microsoft.com/office/word/2018/wordml/cex" xmlns:w16cid="http://schemas.microsoft.com/office/word/2016/wordml/cid" xmlns:w16="http://schemas.microsoft.com/office/word/2018/wordml" xmlns:w16du="http://schemas.microsoft.com/office/word/2023/wordml/word16du" xmlns:w16sdtdh="http://schemas.microsoft.com/office/word/2020/wordml/sdtdatahash" xmlns:w16sdtfl="http://schemas.microsoft.com/office/word/2024/wordml/sdtformatlock" xmlns:w16se="http://schemas.microsoft.com/office/word/2015/wordml/symex" xmlns:wpg="http://schemas.microsoft.com/office/word/2010/wordprocessingGroup" xmlns:wpi="http://schemas.microsoft.com/office/word/2010/wordprocessingInk" xmlns:wne="http://schemas.microsoft.com/office/word/2006/wordml" xmlns:wps="http://schemas.microsoft.com/office/word/2010/wordprocessingShape" mc:Ignorable="w14 w15 w16se w16cid w16 w16cex w16sdtdh w16sdtfl w16du wp14">
   <w:abstractNum w:abstractNumId="0" w15:restartNumberingAfterBreak="0">
+    <w:nsid w:val="090A6E20"/>
+    <w:multiLevelType w:val="multilevel"/>
+    <w:tmpl w:val="4708677C"/>
+    <w:lvl w:ilvl="0">
+      <w:start w:val="1"/>
+      <w:numFmt w:val="bullet"/>
+      <w:lvlText w:val=""/>
+      <w:lvlJc w:val="left"/>
+      <w:pPr>
+        <w:tabs>
+          <w:tab w:val="num" w:pos="720"/>
+        </w:tabs>
+        <w:ind w:left="720" w:hanging="360"/>
+      </w:pPr>
+      <w:rPr>
+        <w:rFonts w:ascii="Symbol" w:hAnsi="Symbol" w:hint="default"/>
+        <w:sz w:val="20"/>
+      </w:rPr>
+    </w:lvl>
+    <w:lvl w:ilvl="1" w:tentative="1">
+      <w:start w:val="1"/>
+      <w:numFmt w:val="bullet"/>
+      <w:lvlText w:val="o"/>
+      <w:lvlJc w:val="left"/>
+      <w:pPr>
+        <w:tabs>
+          <w:tab w:val="num" w:pos="1440"/>
+        </w:tabs>
+        <w:ind w:left="1440" w:hanging="360"/>
+      </w:pPr>
+      <w:rPr>
+        <w:rFonts w:ascii="Courier New" w:hAnsi="Courier New" w:hint="default"/>
+        <w:sz w:val="20"/>
+      </w:rPr>
+    </w:lvl>
+    <w:lvl w:ilvl="2" w:tentative="1">
+      <w:start w:val="1"/>
+      <w:numFmt w:val="bullet"/>
+      <w:lvlText w:val=""/>
+      <w:lvlJc w:val="left"/>
+      <w:pPr>
+        <w:tabs>
+          <w:tab w:val="num" w:pos="2160"/>
+        </w:tabs>
+        <w:ind w:left="2160" w:hanging="360"/>
+      </w:pPr>
+      <w:rPr>
+        <w:rFonts w:ascii="Wingdings" w:hAnsi="Wingdings" w:hint="default"/>
+        <w:sz w:val="20"/>
+      </w:rPr>
+    </w:lvl>
+    <w:lvl w:ilvl="3" w:tentative="1">
+      <w:start w:val="1"/>
+      <w:numFmt w:val="bullet"/>
+      <w:lvlText w:val=""/>
+      <w:lvlJc w:val="left"/>
+      <w:pPr>
+        <w:tabs>
+          <w:tab w:val="num" w:pos="2880"/>
+        </w:tabs>
+        <w:ind w:left="2880" w:hanging="360"/>
+      </w:pPr>
+      <w:rPr>
+        <w:rFonts w:ascii="Wingdings" w:hAnsi="Wingdings" w:hint="default"/>
+        <w:sz w:val="20"/>
+      </w:rPr>
+    </w:lvl>
+    <w:lvl w:ilvl="4" w:tentative="1">
+      <w:start w:val="1"/>
+      <w:numFmt w:val="bullet"/>
+      <w:lvlText w:val=""/>
+      <w:lvlJc w:val="left"/>
+      <w:pPr>
+        <w:tabs>
+          <w:tab w:val="num" w:pos="3600"/>
+        </w:tabs>
+        <w:ind w:left="3600" w:hanging="360"/>
+      </w:pPr>
+      <w:rPr>
+        <w:rFonts w:ascii="Wingdings" w:hAnsi="Wingdings" w:hint="default"/>
+        <w:sz w:val="20"/>
+      </w:rPr>
+    </w:lvl>
+    <w:lvl w:ilvl="5" w:tentative="1">
+      <w:start w:val="1"/>
+      <w:numFmt w:val="bullet"/>
+      <w:lvlText w:val=""/>
+      <w:lvlJc w:val="left"/>
+      <w:pPr>
+        <w:tabs>
+          <w:tab w:val="num" w:pos="4320"/>
+        </w:tabs>
+        <w:ind w:left="4320" w:hanging="360"/>
+      </w:pPr>
+      <w:rPr>
+        <w:rFonts w:ascii="Wingdings" w:hAnsi="Wingdings" w:hint="default"/>
+        <w:sz w:val="20"/>
+      </w:rPr>
+    </w:lvl>
+    <w:lvl w:ilvl="6" w:tentative="1">
+      <w:start w:val="1"/>
+      <w:numFmt w:val="bullet"/>
+      <w:lvlText w:val=""/>
+      <w:lvlJc w:val="left"/>
+      <w:pPr>
+        <w:tabs>
+          <w:tab w:val="num" w:pos="5040"/>
+        </w:tabs>
+        <w:ind w:left="5040" w:hanging="360"/>
+      </w:pPr>
+      <w:rPr>
+        <w:rFonts w:ascii="Wingdings" w:hAnsi="Wingdings" w:hint="default"/>
+        <w:sz w:val="20"/>
+      </w:rPr>
+    </w:lvl>
+    <w:lvl w:ilvl="7" w:tentative="1">
+      <w:start w:val="1"/>
+      <w:numFmt w:val="bullet"/>
+      <w:lvlText w:val=""/>
+      <w:lvlJc w:val="left"/>
+      <w:pPr>
+        <w:tabs>
+          <w:tab w:val="num" w:pos="5760"/>
+        </w:tabs>
+        <w:ind w:left="5760" w:hanging="360"/>
+      </w:pPr>
+      <w:rPr>
+        <w:rFonts w:ascii="Wingdings" w:hAnsi="Wingdings" w:hint="default"/>
+        <w:sz w:val="20"/>
+      </w:rPr>
+    </w:lvl>
+    <w:lvl w:ilvl="8" w:tentative="1">
+      <w:start w:val="1"/>
+      <w:numFmt w:val="bullet"/>
+      <w:lvlText w:val=""/>
+      <w:lvlJc w:val="left"/>
+      <w:pPr>
+        <w:tabs>
+          <w:tab w:val="num" w:pos="6480"/>
+        </w:tabs>
+        <w:ind w:left="6480" w:hanging="360"/>
+      </w:pPr>
+      <w:rPr>
+        <w:rFonts w:ascii="Wingdings" w:hAnsi="Wingdings" w:hint="default"/>
+        <w:sz w:val="20"/>
+      </w:rPr>
+    </w:lvl>
+  </w:abstractNum>
+  <w:abstractNum w:abstractNumId="1" w15:restartNumberingAfterBreak="0">
     <w:nsid w:val="14AF43FB"/>
     <w:multiLevelType w:val="multilevel"/>
     <w:tmpl w:val="7D32597A"/>
@@ -1704,7 +4848,7 @@
       </w:rPr>
     </w:lvl>
   </w:abstractNum>
-  <w:abstractNum w:abstractNumId="1" w15:restartNumberingAfterBreak="0">
+  <w:abstractNum w:abstractNumId="2" w15:restartNumberingAfterBreak="0">
     <w:nsid w:val="231C1EF3"/>
     <w:multiLevelType w:val="multilevel"/>
     <w:tmpl w:val="329E234C"/>
@@ -1853,7 +4997,7 @@
       </w:rPr>
     </w:lvl>
   </w:abstractNum>
-  <w:abstractNum w:abstractNumId="2" w15:restartNumberingAfterBreak="0">
+  <w:abstractNum w:abstractNumId="3" w15:restartNumberingAfterBreak="0">
     <w:nsid w:val="26636923"/>
     <w:multiLevelType w:val="multilevel"/>
     <w:tmpl w:val="757EDC84"/>
@@ -2002,7 +5146,7 @@
       </w:rPr>
     </w:lvl>
   </w:abstractNum>
-  <w:abstractNum w:abstractNumId="3" w15:restartNumberingAfterBreak="0">
+  <w:abstractNum w:abstractNumId="4" w15:restartNumberingAfterBreak="0">
     <w:nsid w:val="407F1391"/>
     <w:multiLevelType w:val="multilevel"/>
     <w:tmpl w:val="9D960DD4"/>
@@ -2151,7 +5295,7 @@
       </w:rPr>
     </w:lvl>
   </w:abstractNum>
-  <w:abstractNum w:abstractNumId="4" w15:restartNumberingAfterBreak="0">
+  <w:abstractNum w:abstractNumId="5" w15:restartNumberingAfterBreak="0">
     <w:nsid w:val="45940664"/>
     <w:multiLevelType w:val="hybridMultilevel"/>
     <w:tmpl w:val="D6ECCA0A"/>
@@ -2264,7 +5408,7 @@
       </w:rPr>
     </w:lvl>
   </w:abstractNum>
-  <w:abstractNum w:abstractNumId="5" w15:restartNumberingAfterBreak="0">
+  <w:abstractNum w:abstractNumId="6" w15:restartNumberingAfterBreak="0">
     <w:nsid w:val="60974754"/>
     <w:multiLevelType w:val="hybridMultilevel"/>
     <w:tmpl w:val="128A7C0C"/>
@@ -2377,7 +5521,7 @@
       </w:rPr>
     </w:lvl>
   </w:abstractNum>
-  <w:abstractNum w:abstractNumId="6" w15:restartNumberingAfterBreak="0">
+  <w:abstractNum w:abstractNumId="7" w15:restartNumberingAfterBreak="0">
     <w:nsid w:val="61BA7AA8"/>
     <w:multiLevelType w:val="hybridMultilevel"/>
     <w:tmpl w:val="F8D0DDEE"/>
@@ -2490,7 +5634,7 @@
       </w:rPr>
     </w:lvl>
   </w:abstractNum>
-  <w:abstractNum w:abstractNumId="7" w15:restartNumberingAfterBreak="0">
+  <w:abstractNum w:abstractNumId="8" w15:restartNumberingAfterBreak="0">
     <w:nsid w:val="684A3B60"/>
     <w:multiLevelType w:val="multilevel"/>
     <w:tmpl w:val="13A27454"/>
@@ -2639,7 +5783,7 @@
       </w:rPr>
     </w:lvl>
   </w:abstractNum>
-  <w:abstractNum w:abstractNumId="8" w15:restartNumberingAfterBreak="0">
+  <w:abstractNum w:abstractNumId="9" w15:restartNumberingAfterBreak="0">
     <w:nsid w:val="70EE282E"/>
     <w:multiLevelType w:val="multilevel"/>
     <w:tmpl w:val="63DA3E64"/>
@@ -2788,7 +5932,7 @@
       </w:rPr>
     </w:lvl>
   </w:abstractNum>
-  <w:abstractNum w:abstractNumId="9" w15:restartNumberingAfterBreak="0">
+  <w:abstractNum w:abstractNumId="10" w15:restartNumberingAfterBreak="0">
     <w:nsid w:val="7220074A"/>
     <w:multiLevelType w:val="hybridMultilevel"/>
     <w:tmpl w:val="75FCE4A0"/>
@@ -2901,7 +6045,7 @@
       </w:rPr>
     </w:lvl>
   </w:abstractNum>
-  <w:abstractNum w:abstractNumId="10" w15:restartNumberingAfterBreak="0">
+  <w:abstractNum w:abstractNumId="11" w15:restartNumberingAfterBreak="0">
     <w:nsid w:val="78103F0B"/>
     <w:multiLevelType w:val="hybridMultilevel"/>
     <w:tmpl w:val="AFD860D6"/>
@@ -3016,37 +6160,40 @@
     </w:lvl>
   </w:abstractNum>
   <w:num w:numId="1" w16cid:durableId="1437021609">
+    <w:abstractNumId w:val="5"/>
+  </w:num>
+  <w:num w:numId="2" w16cid:durableId="1914273573">
+    <w:abstractNumId w:val="10"/>
+  </w:num>
+  <w:num w:numId="3" w16cid:durableId="2140875702">
+    <w:abstractNumId w:val="9"/>
+  </w:num>
+  <w:num w:numId="4" w16cid:durableId="150608361">
+    <w:abstractNumId w:val="1"/>
+  </w:num>
+  <w:num w:numId="5" w16cid:durableId="416439548">
+    <w:abstractNumId w:val="3"/>
+  </w:num>
+  <w:num w:numId="6" w16cid:durableId="455370369">
+    <w:abstractNumId w:val="8"/>
+  </w:num>
+  <w:num w:numId="7" w16cid:durableId="1745496016">
     <w:abstractNumId w:val="4"/>
   </w:num>
-  <w:num w:numId="2" w16cid:durableId="1914273573">
-    <w:abstractNumId w:val="9"/>
-  </w:num>
-  <w:num w:numId="3" w16cid:durableId="2140875702">
-    <w:abstractNumId w:val="8"/>
-  </w:num>
-  <w:num w:numId="4" w16cid:durableId="150608361">
-    <w:abstractNumId w:val="0"/>
-  </w:num>
-  <w:num w:numId="5" w16cid:durableId="416439548">
+  <w:num w:numId="8" w16cid:durableId="1357000701">
     <w:abstractNumId w:val="2"/>
   </w:num>
-  <w:num w:numId="6" w16cid:durableId="455370369">
+  <w:num w:numId="9" w16cid:durableId="1606695248">
     <w:abstractNumId w:val="7"/>
   </w:num>
-  <w:num w:numId="7" w16cid:durableId="1745496016">
-    <w:abstractNumId w:val="3"/>
+  <w:num w:numId="10" w16cid:durableId="1372995817">
+    <w:abstractNumId w:val="11"/>
   </w:num>
-  <w:num w:numId="8" w16cid:durableId="1357000701">
-    <w:abstractNumId w:val="1"/>
-  </w:num>
-  <w:num w:numId="9" w16cid:durableId="1606695248">
+  <w:num w:numId="11" w16cid:durableId="50887064">
     <w:abstractNumId w:val="6"/>
   </w:num>
-  <w:num w:numId="10" w16cid:durableId="1372995817">
-    <w:abstractNumId w:val="10"/>
-  </w:num>
-  <w:num w:numId="11" w16cid:durableId="50887064">
-    <w:abstractNumId w:val="5"/>
+  <w:num w:numId="12" w16cid:durableId="714702257">
+    <w:abstractNumId w:val="0"/>
   </w:num>
 </w:numbering>
 </file>
@@ -3451,6 +6598,16 @@
   <w:style w:type="paragraph" w:default="1" w:styleId="Normal">
     <w:name w:val="Normal"/>
     <w:qFormat/>
+    <w:rsid w:val="00053614"/>
+    <w:pPr>
+      <w:spacing w:after="0" w:line="240" w:lineRule="auto"/>
+    </w:pPr>
+    <w:rPr>
+      <w:rFonts w:ascii="Times New Roman" w:eastAsia="Times New Roman" w:hAnsi="Times New Roman" w:cs="Times New Roman"/>
+      <w:kern w:val="0"/>
+      <w:lang w:eastAsia="en-GB"/>
+      <w14:ligatures w14:val="none"/>
+    </w:rPr>
   </w:style>
   <w:style w:type="paragraph" w:styleId="Heading1">
     <w:name w:val="heading 1"/>
@@ -3479,7 +6636,6 @@
     <w:next w:val="Normal"/>
     <w:link w:val="Heading2Char"/>
     <w:uiPriority w:val="9"/>
-    <w:semiHidden/>
     <w:unhideWhenUsed/>
     <w:qFormat/>
     <w:rsid w:val="00B8031B"/>
@@ -3502,7 +6658,6 @@
     <w:next w:val="Normal"/>
     <w:link w:val="Heading3Char"/>
     <w:uiPriority w:val="9"/>
-    <w:semiHidden/>
     <w:unhideWhenUsed/>
     <w:qFormat/>
     <w:rsid w:val="00B8031B"/>
@@ -3576,7 +6731,7 @@
     <w:pPr>
       <w:keepNext/>
       <w:keepLines/>
-      <w:spacing w:before="40" w:after="0"/>
+      <w:spacing w:before="40"/>
       <w:outlineLvl w:val="5"/>
     </w:pPr>
     <w:rPr>
@@ -3599,7 +6754,7 @@
     <w:pPr>
       <w:keepNext/>
       <w:keepLines/>
-      <w:spacing w:before="40" w:after="0"/>
+      <w:spacing w:before="40"/>
       <w:outlineLvl w:val="6"/>
     </w:pPr>
     <w:rPr>
@@ -3620,7 +6775,6 @@
     <w:pPr>
       <w:keepNext/>
       <w:keepLines/>
-      <w:spacing w:after="0"/>
       <w:outlineLvl w:val="7"/>
     </w:pPr>
     <w:rPr>
@@ -3643,7 +6797,6 @@
     <w:pPr>
       <w:keepNext/>
       <w:keepLines/>
-      <w:spacing w:after="0"/>
       <w:outlineLvl w:val="8"/>
     </w:pPr>
     <w:rPr>
@@ -3696,7 +6849,6 @@
     <w:basedOn w:val="DefaultParagraphFont"/>
     <w:link w:val="Heading2"/>
     <w:uiPriority w:val="9"/>
-    <w:semiHidden/>
     <w:rsid w:val="00B8031B"/>
     <w:rPr>
       <w:rFonts w:asciiTheme="majorHAnsi" w:eastAsiaTheme="majorEastAsia" w:hAnsiTheme="majorHAnsi" w:cstheme="majorBidi"/>
@@ -3710,7 +6862,6 @@
     <w:basedOn w:val="DefaultParagraphFont"/>
     <w:link w:val="Heading3"/>
     <w:uiPriority w:val="9"/>
-    <w:semiHidden/>
     <w:rsid w:val="00B8031B"/>
     <w:rPr>
       <w:rFonts w:eastAsiaTheme="majorEastAsia" w:cstheme="majorBidi"/>
@@ -3806,7 +6957,7 @@
     <w:qFormat/>
     <w:rsid w:val="00B8031B"/>
     <w:pPr>
-      <w:spacing w:after="80" w:line="240" w:lineRule="auto"/>
+      <w:spacing w:after="80"/>
       <w:contextualSpacing/>
     </w:pPr>
     <w:rPr>
@@ -3973,13 +7124,10 @@
     <w:basedOn w:val="Normal"/>
     <w:rsid w:val="00071960"/>
     <w:pPr>
-      <w:spacing w:before="100" w:beforeAutospacing="1" w:after="100" w:afterAutospacing="1" w:line="240" w:lineRule="auto"/>
+      <w:spacing w:before="100" w:beforeAutospacing="1" w:after="100" w:afterAutospacing="1"/>
     </w:pPr>
     <w:rPr>
-      <w:rFonts w:ascii="Times New Roman" w:eastAsia="Times New Roman" w:hAnsi="Times New Roman" w:cs="Times New Roman"/>
-      <w:kern w:val="0"/>
-      <w:lang w:val="en-DE" w:eastAsia="en-GB"/>
-      <w14:ligatures w14:val="none"/>
+      <w:lang/>
     </w:rPr>
   </w:style>
   <w:style w:type="character" w:customStyle="1" w:styleId="normaltextrun">
@@ -4019,7 +7167,7 @@
     <w:unhideWhenUsed/>
     <w:rsid w:val="000F5D0E"/>
     <w:pPr>
-      <w:spacing w:after="240" w:line="240" w:lineRule="auto"/>
+      <w:spacing w:after="240"/>
     </w:pPr>
   </w:style>
   <w:style w:type="character" w:styleId="CommentReference">
@@ -4032,6 +7180,46 @@
     <w:rPr>
       <w:sz w:val="16"/>
       <w:szCs w:val="16"/>
+    </w:rPr>
+  </w:style>
+  <w:style w:type="paragraph" w:styleId="NormalWeb">
+    <w:name w:val="Normal (Web)"/>
+    <w:basedOn w:val="Normal"/>
+    <w:uiPriority w:val="99"/>
+    <w:semiHidden/>
+    <w:unhideWhenUsed/>
+    <w:rsid w:val="00053614"/>
+    <w:pPr>
+      <w:spacing w:before="100" w:beforeAutospacing="1" w:after="100" w:afterAutospacing="1"/>
+    </w:pPr>
+  </w:style>
+  <w:style w:type="character" w:customStyle="1" w:styleId="apple-converted-space">
+    <w:name w:val="apple-converted-space"/>
+    <w:basedOn w:val="DefaultParagraphFont"/>
+    <w:rsid w:val="00053614"/>
+  </w:style>
+  <w:style w:type="character" w:styleId="Strong">
+    <w:name w:val="Strong"/>
+    <w:basedOn w:val="DefaultParagraphFont"/>
+    <w:uiPriority w:val="22"/>
+    <w:qFormat/>
+    <w:rsid w:val="00053614"/>
+    <w:rPr>
+      <w:b/>
+      <w:bCs/>
+    </w:rPr>
+  </w:style>
+  <w:style w:type="character" w:styleId="HTMLCode">
+    <w:name w:val="HTML Code"/>
+    <w:basedOn w:val="DefaultParagraphFont"/>
+    <w:uiPriority w:val="99"/>
+    <w:semiHidden/>
+    <w:unhideWhenUsed/>
+    <w:rsid w:val="00053614"/>
+    <w:rPr>
+      <w:rFonts w:ascii="Courier New" w:eastAsia="Times New Roman" w:hAnsi="Courier New" w:cs="Courier New"/>
+      <w:sz w:val="20"/>
+      <w:szCs w:val="20"/>
     </w:rPr>
   </w:style>
 </w:styles>

</xml_diff>